<commit_message>
Username change and docs
</commit_message>
<xml_diff>
--- a/docs/Login.docx
+++ b/docs/Login.docx
@@ -37,6 +37,7 @@
     </w:p>
     <w:p>
       <w:pPr>
+        <w:jc w:val="center"/>
         <w:rPr>
           <w:rFonts w:eastAsiaTheme="minorEastAsia"/>
           <w:kern w:val="0"/>
@@ -53,11 +54,700 @@
           <w:szCs w:val="56"/>
           <w14:ligatures w14:val="none"/>
         </w:rPr>
-        <w:t>Authentication and Authorisation</w:t>
+        <w:t>Login (</w:t>
+      </w:r>
+      <w:r>
+        <w:rPr>
+          <w:rFonts w:eastAsiaTheme="minorEastAsia"/>
+          <w:kern w:val="0"/>
+          <w:sz w:val="56"/>
+          <w:szCs w:val="56"/>
+          <w14:ligatures w14:val="none"/>
+        </w:rPr>
+        <w:t>Authentication</w:t>
+      </w:r>
+      <w:r>
+        <w:rPr>
+          <w:rFonts w:eastAsiaTheme="minorEastAsia"/>
+          <w:kern w:val="0"/>
+          <w:sz w:val="56"/>
+          <w:szCs w:val="56"/>
+          <w14:ligatures w14:val="none"/>
+        </w:rPr>
+        <w:t>)</w:t>
       </w:r>
     </w:p>
     <w:p/>
     <w:p/>
+    <w:sdt>
+      <w:sdtPr>
+        <w:id w:val="-482388924"/>
+        <w:docPartObj>
+          <w:docPartGallery w:val="Table of Contents"/>
+          <w:docPartUnique/>
+        </w:docPartObj>
+      </w:sdtPr>
+      <w:sdtEndPr>
+        <w:rPr>
+          <w:rFonts w:asciiTheme="minorHAnsi" w:eastAsiaTheme="minorHAnsi" w:hAnsiTheme="minorHAnsi" w:cstheme="minorBidi"/>
+          <w:b/>
+          <w:bCs/>
+          <w:noProof/>
+          <w:color w:val="auto"/>
+          <w:kern w:val="2"/>
+          <w:sz w:val="24"/>
+          <w:szCs w:val="24"/>
+          <w:lang w:val="en-NZ"/>
+          <w14:ligatures w14:val="standardContextual"/>
+        </w:rPr>
+      </w:sdtEndPr>
+      <w:sdtContent>
+        <w:p>
+          <w:pPr>
+            <w:pStyle w:val="TOCHeading"/>
+          </w:pPr>
+          <w:r>
+            <w:t>Contents</w:t>
+          </w:r>
+        </w:p>
+        <w:p>
+          <w:pPr>
+            <w:pStyle w:val="TOC1"/>
+            <w:tabs>
+              <w:tab w:val="right" w:leader="dot" w:pos="9016"/>
+            </w:tabs>
+            <w:rPr>
+              <w:noProof/>
+            </w:rPr>
+          </w:pPr>
+          <w:r>
+            <w:fldChar w:fldCharType="begin"/>
+          </w:r>
+          <w:r>
+            <w:instrText xml:space="preserve"> TOC \o "1-3" \h \z \u </w:instrText>
+          </w:r>
+          <w:r>
+            <w:fldChar w:fldCharType="separate"/>
+          </w:r>
+          <w:hyperlink w:anchor="_Toc234331593" w:history="1">
+            <w:r>
+              <w:rPr>
+                <w:rStyle w:val="Hyperlink"/>
+                <w:noProof/>
+                <w:kern w:val="0"/>
+                <w14:ligatures w14:val="none"/>
+              </w:rPr>
+              <w:t>Login</w:t>
+            </w:r>
+            <w:r>
+              <w:rPr>
+                <w:noProof/>
+                <w:webHidden/>
+              </w:rPr>
+              <w:tab/>
+            </w:r>
+            <w:r>
+              <w:rPr>
+                <w:noProof/>
+                <w:webHidden/>
+              </w:rPr>
+              <w:fldChar w:fldCharType="begin"/>
+            </w:r>
+            <w:r>
+              <w:rPr>
+                <w:noProof/>
+                <w:webHidden/>
+              </w:rPr>
+              <w:instrText xml:space="preserve"> PAGEREF _Toc234331593 \h </w:instrText>
+            </w:r>
+            <w:r>
+              <w:rPr>
+                <w:noProof/>
+                <w:webHidden/>
+              </w:rPr>
+            </w:r>
+            <w:r>
+              <w:rPr>
+                <w:noProof/>
+                <w:webHidden/>
+              </w:rPr>
+              <w:fldChar w:fldCharType="separate"/>
+            </w:r>
+            <w:r>
+              <w:rPr>
+                <w:noProof/>
+                <w:webHidden/>
+              </w:rPr>
+              <w:t>2</w:t>
+            </w:r>
+            <w:r>
+              <w:rPr>
+                <w:noProof/>
+                <w:webHidden/>
+              </w:rPr>
+              <w:fldChar w:fldCharType="end"/>
+            </w:r>
+          </w:hyperlink>
+        </w:p>
+        <w:p>
+          <w:pPr>
+            <w:pStyle w:val="TOC2"/>
+            <w:tabs>
+              <w:tab w:val="right" w:leader="dot" w:pos="9016"/>
+            </w:tabs>
+            <w:rPr>
+              <w:noProof/>
+            </w:rPr>
+          </w:pPr>
+          <w:hyperlink w:anchor="_Toc234331594" w:history="1">
+            <w:r>
+              <w:rPr>
+                <w:rStyle w:val="Hyperlink"/>
+                <w:noProof/>
+              </w:rPr>
+              <w:t>Legacy Login</w:t>
+            </w:r>
+            <w:r>
+              <w:rPr>
+                <w:noProof/>
+                <w:webHidden/>
+              </w:rPr>
+              <w:tab/>
+            </w:r>
+            <w:r>
+              <w:rPr>
+                <w:noProof/>
+                <w:webHidden/>
+              </w:rPr>
+              <w:fldChar w:fldCharType="begin"/>
+            </w:r>
+            <w:r>
+              <w:rPr>
+                <w:noProof/>
+                <w:webHidden/>
+              </w:rPr>
+              <w:instrText xml:space="preserve"> PAGEREF _Toc234331594 \h </w:instrText>
+            </w:r>
+            <w:r>
+              <w:rPr>
+                <w:noProof/>
+                <w:webHidden/>
+              </w:rPr>
+            </w:r>
+            <w:r>
+              <w:rPr>
+                <w:noProof/>
+                <w:webHidden/>
+              </w:rPr>
+              <w:fldChar w:fldCharType="separate"/>
+            </w:r>
+            <w:r>
+              <w:rPr>
+                <w:noProof/>
+                <w:webHidden/>
+              </w:rPr>
+              <w:t>2</w:t>
+            </w:r>
+            <w:r>
+              <w:rPr>
+                <w:noProof/>
+                <w:webHidden/>
+              </w:rPr>
+              <w:fldChar w:fldCharType="end"/>
+            </w:r>
+          </w:hyperlink>
+        </w:p>
+        <w:p>
+          <w:pPr>
+            <w:pStyle w:val="TOC2"/>
+            <w:tabs>
+              <w:tab w:val="right" w:leader="dot" w:pos="9016"/>
+            </w:tabs>
+            <w:rPr>
+              <w:noProof/>
+            </w:rPr>
+          </w:pPr>
+          <w:hyperlink w:anchor="_Toc234331595" w:history="1">
+            <w:r>
+              <w:rPr>
+                <w:rStyle w:val="Hyperlink"/>
+                <w:noProof/>
+              </w:rPr>
+              <w:t>Language Choice</w:t>
+            </w:r>
+            <w:r>
+              <w:rPr>
+                <w:noProof/>
+                <w:webHidden/>
+              </w:rPr>
+              <w:tab/>
+            </w:r>
+            <w:r>
+              <w:rPr>
+                <w:noProof/>
+                <w:webHidden/>
+              </w:rPr>
+              <w:fldChar w:fldCharType="begin"/>
+            </w:r>
+            <w:r>
+              <w:rPr>
+                <w:noProof/>
+                <w:webHidden/>
+              </w:rPr>
+              <w:instrText xml:space="preserve"> PAGEREF _Toc234331595 \h </w:instrText>
+            </w:r>
+            <w:r>
+              <w:rPr>
+                <w:noProof/>
+                <w:webHidden/>
+              </w:rPr>
+            </w:r>
+            <w:r>
+              <w:rPr>
+                <w:noProof/>
+                <w:webHidden/>
+              </w:rPr>
+              <w:fldChar w:fldCharType="separate"/>
+            </w:r>
+            <w:r>
+              <w:rPr>
+                <w:noProof/>
+                <w:webHidden/>
+              </w:rPr>
+              <w:t>3</w:t>
+            </w:r>
+            <w:r>
+              <w:rPr>
+                <w:noProof/>
+                <w:webHidden/>
+              </w:rPr>
+              <w:fldChar w:fldCharType="end"/>
+            </w:r>
+          </w:hyperlink>
+        </w:p>
+        <w:p>
+          <w:pPr>
+            <w:pStyle w:val="TOC2"/>
+            <w:tabs>
+              <w:tab w:val="right" w:leader="dot" w:pos="9016"/>
+            </w:tabs>
+            <w:rPr>
+              <w:noProof/>
+            </w:rPr>
+          </w:pPr>
+          <w:hyperlink w:anchor="_Toc234331596" w:history="1">
+            <w:r>
+              <w:rPr>
+                <w:rStyle w:val="Hyperlink"/>
+                <w:noProof/>
+              </w:rPr>
+              <w:t>Org Nr Choice</w:t>
+            </w:r>
+            <w:r>
+              <w:rPr>
+                <w:noProof/>
+                <w:webHidden/>
+              </w:rPr>
+              <w:tab/>
+            </w:r>
+            <w:r>
+              <w:rPr>
+                <w:noProof/>
+                <w:webHidden/>
+              </w:rPr>
+              <w:fldChar w:fldCharType="begin"/>
+            </w:r>
+            <w:r>
+              <w:rPr>
+                <w:noProof/>
+                <w:webHidden/>
+              </w:rPr>
+              <w:instrText xml:space="preserve"> PAGEREF _Toc234331596 \h </w:instrText>
+            </w:r>
+            <w:r>
+              <w:rPr>
+                <w:noProof/>
+                <w:webHidden/>
+              </w:rPr>
+            </w:r>
+            <w:r>
+              <w:rPr>
+                <w:noProof/>
+                <w:webHidden/>
+              </w:rPr>
+              <w:fldChar w:fldCharType="separate"/>
+            </w:r>
+            <w:r>
+              <w:rPr>
+                <w:noProof/>
+                <w:webHidden/>
+              </w:rPr>
+              <w:t>3</w:t>
+            </w:r>
+            <w:r>
+              <w:rPr>
+                <w:noProof/>
+                <w:webHidden/>
+              </w:rPr>
+              <w:fldChar w:fldCharType="end"/>
+            </w:r>
+          </w:hyperlink>
+        </w:p>
+        <w:p>
+          <w:pPr>
+            <w:pStyle w:val="TOC2"/>
+            <w:tabs>
+              <w:tab w:val="right" w:leader="dot" w:pos="9016"/>
+            </w:tabs>
+            <w:rPr>
+              <w:noProof/>
+            </w:rPr>
+          </w:pPr>
+          <w:hyperlink w:anchor="_Toc234331597" w:history="1">
+            <w:r>
+              <w:rPr>
+                <w:rStyle w:val="Hyperlink"/>
+                <w:noProof/>
+              </w:rPr>
+              <w:t>MFA</w:t>
+            </w:r>
+            <w:r>
+              <w:rPr>
+                <w:noProof/>
+                <w:webHidden/>
+              </w:rPr>
+              <w:tab/>
+            </w:r>
+            <w:r>
+              <w:rPr>
+                <w:noProof/>
+                <w:webHidden/>
+              </w:rPr>
+              <w:fldChar w:fldCharType="begin"/>
+            </w:r>
+            <w:r>
+              <w:rPr>
+                <w:noProof/>
+                <w:webHidden/>
+              </w:rPr>
+              <w:instrText xml:space="preserve"> PAGEREF _Toc234331597 \h </w:instrText>
+            </w:r>
+            <w:r>
+              <w:rPr>
+                <w:noProof/>
+                <w:webHidden/>
+              </w:rPr>
+            </w:r>
+            <w:r>
+              <w:rPr>
+                <w:noProof/>
+                <w:webHidden/>
+              </w:rPr>
+              <w:fldChar w:fldCharType="separate"/>
+            </w:r>
+            <w:r>
+              <w:rPr>
+                <w:noProof/>
+                <w:webHidden/>
+              </w:rPr>
+              <w:t>3</w:t>
+            </w:r>
+            <w:r>
+              <w:rPr>
+                <w:noProof/>
+                <w:webHidden/>
+              </w:rPr>
+              <w:fldChar w:fldCharType="end"/>
+            </w:r>
+          </w:hyperlink>
+        </w:p>
+        <w:p>
+          <w:pPr>
+            <w:pStyle w:val="TOC2"/>
+            <w:tabs>
+              <w:tab w:val="right" w:leader="dot" w:pos="9016"/>
+            </w:tabs>
+            <w:rPr>
+              <w:noProof/>
+            </w:rPr>
+          </w:pPr>
+          <w:hyperlink w:anchor="_Toc234331598" w:history="1">
+            <w:r>
+              <w:rPr>
+                <w:rStyle w:val="Hyperlink"/>
+                <w:noProof/>
+              </w:rPr>
+              <w:t>Forgot Username / Password</w:t>
+            </w:r>
+            <w:r>
+              <w:rPr>
+                <w:noProof/>
+                <w:webHidden/>
+              </w:rPr>
+              <w:tab/>
+            </w:r>
+            <w:r>
+              <w:rPr>
+                <w:noProof/>
+                <w:webHidden/>
+              </w:rPr>
+              <w:fldChar w:fldCharType="begin"/>
+            </w:r>
+            <w:r>
+              <w:rPr>
+                <w:noProof/>
+                <w:webHidden/>
+              </w:rPr>
+              <w:instrText xml:space="preserve"> PAGEREF _Toc234331598 \h </w:instrText>
+            </w:r>
+            <w:r>
+              <w:rPr>
+                <w:noProof/>
+                <w:webHidden/>
+              </w:rPr>
+            </w:r>
+            <w:r>
+              <w:rPr>
+                <w:noProof/>
+                <w:webHidden/>
+              </w:rPr>
+              <w:fldChar w:fldCharType="separate"/>
+            </w:r>
+            <w:r>
+              <w:rPr>
+                <w:noProof/>
+                <w:webHidden/>
+              </w:rPr>
+              <w:t>3</w:t>
+            </w:r>
+            <w:r>
+              <w:rPr>
+                <w:noProof/>
+                <w:webHidden/>
+              </w:rPr>
+              <w:fldChar w:fldCharType="end"/>
+            </w:r>
+          </w:hyperlink>
+        </w:p>
+        <w:p>
+          <w:pPr>
+            <w:pStyle w:val="TOC2"/>
+            <w:tabs>
+              <w:tab w:val="right" w:leader="dot" w:pos="9016"/>
+            </w:tabs>
+            <w:rPr>
+              <w:noProof/>
+            </w:rPr>
+          </w:pPr>
+          <w:hyperlink w:anchor="_Toc234331599" w:history="1">
+            <w:r>
+              <w:rPr>
+                <w:rStyle w:val="Hyperlink"/>
+                <w:noProof/>
+              </w:rPr>
+              <w:t>Self-Registration (Signup)</w:t>
+            </w:r>
+            <w:r>
+              <w:rPr>
+                <w:noProof/>
+                <w:webHidden/>
+              </w:rPr>
+              <w:tab/>
+            </w:r>
+            <w:r>
+              <w:rPr>
+                <w:noProof/>
+                <w:webHidden/>
+              </w:rPr>
+              <w:fldChar w:fldCharType="begin"/>
+            </w:r>
+            <w:r>
+              <w:rPr>
+                <w:noProof/>
+                <w:webHidden/>
+              </w:rPr>
+              <w:instrText xml:space="preserve"> PAGEREF _Toc234331599 \h </w:instrText>
+            </w:r>
+            <w:r>
+              <w:rPr>
+                <w:noProof/>
+                <w:webHidden/>
+              </w:rPr>
+            </w:r>
+            <w:r>
+              <w:rPr>
+                <w:noProof/>
+                <w:webHidden/>
+              </w:rPr>
+              <w:fldChar w:fldCharType="separate"/>
+            </w:r>
+            <w:r>
+              <w:rPr>
+                <w:noProof/>
+                <w:webHidden/>
+              </w:rPr>
+              <w:t>3</w:t>
+            </w:r>
+            <w:r>
+              <w:rPr>
+                <w:noProof/>
+                <w:webHidden/>
+              </w:rPr>
+              <w:fldChar w:fldCharType="end"/>
+            </w:r>
+          </w:hyperlink>
+        </w:p>
+        <w:p>
+          <w:pPr>
+            <w:pStyle w:val="TOC2"/>
+            <w:tabs>
+              <w:tab w:val="right" w:leader="dot" w:pos="9016"/>
+            </w:tabs>
+            <w:rPr>
+              <w:noProof/>
+            </w:rPr>
+          </w:pPr>
+          <w:hyperlink w:anchor="_Toc234331600" w:history="1">
+            <w:r>
+              <w:rPr>
+                <w:rStyle w:val="Hyperlink"/>
+                <w:noProof/>
+              </w:rPr>
+              <w:t>Email Address Verification</w:t>
+            </w:r>
+            <w:r>
+              <w:rPr>
+                <w:noProof/>
+                <w:webHidden/>
+              </w:rPr>
+              <w:tab/>
+            </w:r>
+            <w:r>
+              <w:rPr>
+                <w:noProof/>
+                <w:webHidden/>
+              </w:rPr>
+              <w:fldChar w:fldCharType="begin"/>
+            </w:r>
+            <w:r>
+              <w:rPr>
+                <w:noProof/>
+                <w:webHidden/>
+              </w:rPr>
+              <w:instrText xml:space="preserve"> PAGEREF _Toc234331600 \h </w:instrText>
+            </w:r>
+            <w:r>
+              <w:rPr>
+                <w:noProof/>
+                <w:webHidden/>
+              </w:rPr>
+            </w:r>
+            <w:r>
+              <w:rPr>
+                <w:noProof/>
+                <w:webHidden/>
+              </w:rPr>
+              <w:fldChar w:fldCharType="separate"/>
+            </w:r>
+            <w:r>
+              <w:rPr>
+                <w:noProof/>
+                <w:webHidden/>
+              </w:rPr>
+              <w:t>4</w:t>
+            </w:r>
+            <w:r>
+              <w:rPr>
+                <w:noProof/>
+                <w:webHidden/>
+              </w:rPr>
+              <w:fldChar w:fldCharType="end"/>
+            </w:r>
+          </w:hyperlink>
+        </w:p>
+        <w:p>
+          <w:pPr>
+            <w:pStyle w:val="TOC1"/>
+            <w:tabs>
+              <w:tab w:val="right" w:leader="dot" w:pos="9016"/>
+            </w:tabs>
+            <w:rPr>
+              <w:noProof/>
+            </w:rPr>
+          </w:pPr>
+          <w:hyperlink w:anchor="_Toc234331601" w:history="1">
+            <w:r>
+              <w:rPr>
+                <w:rStyle w:val="Hyperlink"/>
+                <w:noProof/>
+                <w:kern w:val="0"/>
+                <w14:ligatures w14:val="none"/>
+              </w:rPr>
+              <w:t>Authentication</w:t>
+            </w:r>
+            <w:r>
+              <w:rPr>
+                <w:noProof/>
+                <w:webHidden/>
+              </w:rPr>
+              <w:tab/>
+            </w:r>
+            <w:r>
+              <w:rPr>
+                <w:noProof/>
+                <w:webHidden/>
+              </w:rPr>
+              <w:fldChar w:fldCharType="begin"/>
+            </w:r>
+            <w:r>
+              <w:rPr>
+                <w:noProof/>
+                <w:webHidden/>
+              </w:rPr>
+              <w:instrText xml:space="preserve"> PAGEREF _Toc234331601 \h </w:instrText>
+            </w:r>
+            <w:r>
+              <w:rPr>
+                <w:noProof/>
+                <w:webHidden/>
+              </w:rPr>
+            </w:r>
+            <w:r>
+              <w:rPr>
+                <w:noProof/>
+                <w:webHidden/>
+              </w:rPr>
+              <w:fldChar w:fldCharType="separate"/>
+            </w:r>
+            <w:r>
+              <w:rPr>
+                <w:noProof/>
+                <w:webHidden/>
+              </w:rPr>
+              <w:t>4</w:t>
+            </w:r>
+            <w:r>
+              <w:rPr>
+                <w:noProof/>
+                <w:webHidden/>
+              </w:rPr>
+              <w:fldChar w:fldCharType="end"/>
+            </w:r>
+          </w:hyperlink>
+        </w:p>
+        <w:p>
+          <w:r>
+            <w:rPr>
+              <w:b/>
+              <w:bCs/>
+              <w:noProof/>
+            </w:rPr>
+            <w:fldChar w:fldCharType="end"/>
+          </w:r>
+        </w:p>
+      </w:sdtContent>
+    </w:sdt>
+    <w:p/>
     <w:p>
       <w:r>
         <w:br w:type="page"/>
@@ -68,6 +758,7 @@
         <w:pStyle w:val="Heading1"/>
         <w:spacing w:before="400" w:after="40" w:line="240" w:lineRule="auto"/>
       </w:pPr>
+      <w:bookmarkStart w:id="0" w:name="_Toc234331593"/>
       <w:r>
         <w:rPr>
           <w:color w:val="0A2F41" w:themeColor="accent1" w:themeShade="80"/>
@@ -78,7 +769,696 @@
           <w14:ligatures w14:val="none"/>
         </w:rPr>
         <w:lastRenderedPageBreak/>
+        <w:t>Login</w:t>
+      </w:r>
+      <w:bookmarkEnd w:id="0"/>
+    </w:p>
+    <w:p>
+      <w:pPr>
+        <w:rPr>
+          <w:i/>
+          <w:iCs/>
+        </w:rPr>
+      </w:pPr>
+      <w:r>
+        <w:rPr>
+          <w:i/>
+          <w:iCs/>
+        </w:rPr>
+        <w:t>A</w:t>
+      </w:r>
+      <w:r>
+        <w:rPr>
+          <w:i/>
+          <w:iCs/>
+        </w:rPr>
+        <w:t>uthenticating a user by entering credentials</w:t>
+      </w:r>
+      <w:r>
+        <w:rPr>
+          <w:i/>
+          <w:iCs/>
+        </w:rPr>
+        <w:t>.</w:t>
+      </w:r>
+    </w:p>
+    <w:p>
+      <w:r>
+        <w:t xml:space="preserve">Loging into the application is via the FrontendLogin Blazor Server project. Once a user is successfully authenticated the backend will forward a </w:t>
+      </w:r>
+      <w:r>
+        <w:t>short-lived</w:t>
+      </w:r>
+      <w:r>
+        <w:t xml:space="preserve"> Json Web Token</w:t>
+      </w:r>
+      <w:r>
+        <w:t xml:space="preserve"> (JWT)</w:t>
+      </w:r>
+      <w:r>
+        <w:t xml:space="preserve"> </w:t>
+      </w:r>
+      <w:r>
+        <w:t>that is used to access either:</w:t>
+      </w:r>
+    </w:p>
+    <w:p>
+      <w:pPr>
+        <w:pStyle w:val="ListParagraph"/>
+        <w:numPr>
+          <w:ilvl w:val="0"/>
+          <w:numId w:val="2"/>
+        </w:numPr>
+      </w:pPr>
+      <w:r>
+        <w:t>Access t</w:t>
+      </w:r>
+      <w:r>
+        <w:t>he main web client (FrontendServer Blazor Server project).</w:t>
+      </w:r>
+      <w:r>
+        <w:t xml:space="preserve"> Along with the JWT, the main URL is sent and used to navigate to.</w:t>
+      </w:r>
+    </w:p>
+    <w:p>
+      <w:pPr>
+        <w:pStyle w:val="ListParagraph"/>
+        <w:numPr>
+          <w:ilvl w:val="0"/>
+          <w:numId w:val="2"/>
+        </w:numPr>
+      </w:pPr>
+      <w:r>
+        <w:t xml:space="preserve">Using the JWT, request a refresh token to then access the </w:t>
+      </w:r>
+      <w:r>
+        <w:t>Backend API project.</w:t>
+      </w:r>
+      <w:r>
+        <w:t xml:space="preserve"> This will be used by non-web clients.</w:t>
+      </w:r>
+    </w:p>
+    <w:p>
+      <w:r>
+        <w:t>Options for t</w:t>
+      </w:r>
+      <w:r>
+        <w:t>he login process</w:t>
+      </w:r>
+      <w:r>
+        <w:t xml:space="preserve"> </w:t>
+      </w:r>
+      <w:r>
+        <w:t>are</w:t>
+      </w:r>
+      <w:r>
+        <w:t xml:space="preserve"> configured via the Organisation (Org) entity</w:t>
+      </w:r>
+      <w:r>
+        <w:t xml:space="preserve"> and the </w:t>
+      </w:r>
+      <w:r>
+        <w:t>LoginOption table</w:t>
+      </w:r>
+      <w:r>
+        <w:t xml:space="preserve">. </w:t>
+      </w:r>
+      <w:r>
+        <w:t xml:space="preserve">Note the </w:t>
+      </w:r>
+      <w:r>
+        <w:t>LoginOption</w:t>
+      </w:r>
+      <w:r>
+        <w:t xml:space="preserve"> is manually configured – this may change in future with it being derived from the Org entity. </w:t>
+      </w:r>
+    </w:p>
+    <w:p>
+      <w:r>
+        <w:t>Each</w:t>
+      </w:r>
+      <w:r>
+        <w:t xml:space="preserve"> login option</w:t>
+      </w:r>
+      <w:r>
+        <w:t xml:space="preserve"> configuration is identified via a code. This is used as a URL suffix when opening the </w:t>
+      </w:r>
+      <w:r>
+        <w:t>login</w:t>
+      </w:r>
+      <w:r>
+        <w:t xml:space="preserve"> client. E.g., [host]/[code].</w:t>
+      </w:r>
+    </w:p>
+    <w:p>
+      <w:r>
+        <w:t xml:space="preserve">The login options </w:t>
+      </w:r>
+      <w:r>
+        <w:t xml:space="preserve">to be enabled </w:t>
+      </w:r>
+      <w:r>
+        <w:t>are:</w:t>
+      </w:r>
+    </w:p>
+    <w:p>
+      <w:pPr>
+        <w:pStyle w:val="ListParagraph"/>
+        <w:numPr>
+          <w:ilvl w:val="0"/>
+          <w:numId w:val="2"/>
+        </w:numPr>
+      </w:pPr>
+      <w:r>
+        <w:t>Org nr to log into, or org numbers to choose from.</w:t>
+      </w:r>
+    </w:p>
+    <w:p>
+      <w:pPr>
+        <w:pStyle w:val="ListParagraph"/>
+        <w:numPr>
+          <w:ilvl w:val="0"/>
+          <w:numId w:val="2"/>
+        </w:numPr>
+      </w:pPr>
+      <w:r>
+        <w:t>Language code choice, e.g. English, German, etc.</w:t>
+      </w:r>
+    </w:p>
+    <w:p>
+      <w:pPr>
+        <w:pStyle w:val="ListParagraph"/>
+        <w:numPr>
+          <w:ilvl w:val="0"/>
+          <w:numId w:val="2"/>
+        </w:numPr>
+      </w:pPr>
+      <w:r>
+        <w:t>Enable Multi Factor Authentication (</w:t>
+      </w:r>
+      <w:r>
+        <w:t>MFA</w:t>
+      </w:r>
+      <w:r>
+        <w:t>)</w:t>
+      </w:r>
+      <w:r>
+        <w:t>.</w:t>
+      </w:r>
+    </w:p>
+    <w:p>
+      <w:pPr>
+        <w:pStyle w:val="ListParagraph"/>
+        <w:numPr>
+          <w:ilvl w:val="0"/>
+          <w:numId w:val="2"/>
+        </w:numPr>
+      </w:pPr>
+      <w:r>
+        <w:t>Forgot username and / or password.</w:t>
+      </w:r>
+    </w:p>
+    <w:p>
+      <w:pPr>
+        <w:pStyle w:val="ListParagraph"/>
+        <w:numPr>
+          <w:ilvl w:val="0"/>
+          <w:numId w:val="2"/>
+        </w:numPr>
+      </w:pPr>
+      <w:r>
+        <w:t>Self-registration.</w:t>
+      </w:r>
+    </w:p>
+    <w:p>
+      <w:pPr>
+        <w:pStyle w:val="ListParagraph"/>
+        <w:numPr>
+          <w:ilvl w:val="0"/>
+          <w:numId w:val="2"/>
+        </w:numPr>
+      </w:pPr>
+      <w:r>
+        <w:t>Email address verification.</w:t>
+      </w:r>
+    </w:p>
+    <w:p/>
+    <w:p>
+      <w:pPr>
+        <w:pStyle w:val="Heading2"/>
+      </w:pPr>
+      <w:bookmarkStart w:id="1" w:name="_Toc234331594"/>
+      <w:r>
+        <w:t xml:space="preserve">Legacy </w:t>
+      </w:r>
+      <w:r>
+        <w:t>Login</w:t>
+      </w:r>
+      <w:bookmarkEnd w:id="1"/>
+    </w:p>
+    <w:p>
+      <w:r>
+        <w:t xml:space="preserve">Standard username / password combination. </w:t>
+      </w:r>
+    </w:p>
+    <w:p>
+      <w:pPr>
+        <w:pStyle w:val="ListParagraph"/>
+        <w:numPr>
+          <w:ilvl w:val="0"/>
+          <w:numId w:val="2"/>
+        </w:numPr>
+      </w:pPr>
+      <w:r>
+        <w:t>A system administrator must add the user prior to them logging in.</w:t>
+      </w:r>
+    </w:p>
+    <w:p>
+      <w:pPr>
+        <w:pStyle w:val="ListParagraph"/>
+        <w:numPr>
+          <w:ilvl w:val="0"/>
+          <w:numId w:val="2"/>
+        </w:numPr>
+      </w:pPr>
+      <w:r>
+        <w:t>The Org entity allows configuration of the password rules.</w:t>
+      </w:r>
+    </w:p>
+    <w:p>
+      <w:pPr>
+        <w:pStyle w:val="ListParagraph"/>
+        <w:numPr>
+          <w:ilvl w:val="0"/>
+          <w:numId w:val="2"/>
+        </w:numPr>
+      </w:pPr>
+      <w:r>
+        <w:t>Org nr and language selection (if given)</w:t>
+      </w:r>
+    </w:p>
+    <w:p>
+      <w:r>
+        <w:t>Upon a successful authentication, the system will:</w:t>
+      </w:r>
+    </w:p>
+    <w:p>
+      <w:pPr>
+        <w:pStyle w:val="ListParagraph"/>
+        <w:numPr>
+          <w:ilvl w:val="0"/>
+          <w:numId w:val="2"/>
+        </w:numPr>
+      </w:pPr>
+      <w:r>
+        <w:t>Issue a JWT. This is short lived at 15 minutes.</w:t>
+      </w:r>
+    </w:p>
+    <w:p>
+      <w:pPr>
+        <w:pStyle w:val="ListParagraph"/>
+        <w:numPr>
+          <w:ilvl w:val="0"/>
+          <w:numId w:val="2"/>
+        </w:numPr>
+      </w:pPr>
+      <w:r>
+        <w:t>If they are a web user (default) the system will redirect to the main URL.</w:t>
+      </w:r>
+      <w:r>
+        <w:t xml:space="preserve"> Upon entering the main client, the system will seek a refresh token using the JWT.</w:t>
+      </w:r>
+    </w:p>
+    <w:p>
+      <w:pPr>
+        <w:pStyle w:val="ListParagraph"/>
+        <w:numPr>
+          <w:ilvl w:val="0"/>
+          <w:numId w:val="2"/>
+        </w:numPr>
+      </w:pPr>
+      <w:r>
+        <w:t>If they are a non-web client user, then the refresh token will be requested and displayed. No further action will occur.</w:t>
+      </w:r>
+    </w:p>
+    <w:p/>
+    <w:p>
+      <w:pPr>
+        <w:pStyle w:val="Heading2"/>
+      </w:pPr>
+      <w:bookmarkStart w:id="2" w:name="_Toc234331595"/>
+      <w:r>
+        <w:lastRenderedPageBreak/>
+        <w:t>Language Choice</w:t>
+      </w:r>
+      <w:bookmarkEnd w:id="2"/>
+    </w:p>
+    <w:p>
+      <w:r>
+        <w:t xml:space="preserve">The display language can be chosen via a drop-down. Once chosen it will be used to the main client. </w:t>
+      </w:r>
+    </w:p>
+    <w:p>
+      <w:r>
+        <w:t>If this option is not available, then the Org default language code will be used.</w:t>
+      </w:r>
+    </w:p>
+    <w:p/>
+    <w:p>
+      <w:pPr>
+        <w:pStyle w:val="Heading2"/>
+      </w:pPr>
+      <w:bookmarkStart w:id="3" w:name="_Toc234331596"/>
+      <w:r>
+        <w:t>Org Nr</w:t>
+      </w:r>
+      <w:r>
+        <w:t xml:space="preserve"> Choice</w:t>
+      </w:r>
+      <w:bookmarkEnd w:id="3"/>
+    </w:p>
+    <w:p>
+      <w:r>
+        <w:t>If available, the user can choose which org nr they wish to log into.</w:t>
+      </w:r>
+    </w:p>
+    <w:p>
+      <w:r>
+        <w:t xml:space="preserve">If this option is not available, then the Org </w:t>
+      </w:r>
+      <w:r>
+        <w:t>Nr in the Loginoptions table will used.</w:t>
+      </w:r>
+    </w:p>
+    <w:p>
+      <w:r>
+        <w:t>Note: A user must first be given access rights to an Org Nr before being able to login into it.</w:t>
+      </w:r>
+    </w:p>
+    <w:p/>
+    <w:p>
+      <w:pPr>
+        <w:pStyle w:val="Heading2"/>
+      </w:pPr>
+      <w:bookmarkStart w:id="4" w:name="_Toc234331597"/>
+      <w:r>
+        <w:t>MFA</w:t>
+      </w:r>
+      <w:bookmarkEnd w:id="4"/>
+    </w:p>
+    <w:p>
+      <w:r>
+        <w:t xml:space="preserve">If enforced, the user will be presented with a QR Code to configure their cell phone’s </w:t>
+      </w:r>
+      <w:r>
+        <w:t>Authenticator app</w:t>
+      </w:r>
+      <w:r>
+        <w:t xml:space="preserve">. </w:t>
+      </w:r>
+    </w:p>
+    <w:p>
+      <w:r>
+        <w:t xml:space="preserve">Once </w:t>
+      </w:r>
+      <w:r>
+        <w:t xml:space="preserve">MFA is </w:t>
+      </w:r>
+      <w:r>
+        <w:t xml:space="preserve">configured the user will be challenged </w:t>
+      </w:r>
+      <w:r>
+        <w:t xml:space="preserve">after a successful login </w:t>
+      </w:r>
+      <w:r>
+        <w:t>to provide the a</w:t>
+      </w:r>
+      <w:r>
+        <w:t>uthenticator</w:t>
+      </w:r>
+      <w:r>
+        <w:t xml:space="preserve"> code.</w:t>
+      </w:r>
+      <w:r>
+        <w:t xml:space="preserve"> This step must also be successful before they are redirected to the main client (or have the refresh token displayed for non-web clients). </w:t>
+      </w:r>
+    </w:p>
+    <w:p/>
+    <w:p>
+      <w:pPr>
+        <w:pStyle w:val="Heading2"/>
+      </w:pPr>
+      <w:bookmarkStart w:id="5" w:name="_Toc234331598"/>
+      <w:r>
+        <w:t>Forgot Username / Password</w:t>
+      </w:r>
+      <w:bookmarkEnd w:id="5"/>
+    </w:p>
+    <w:p>
+      <w:r>
+        <w:t>If users forget their credentials, they can request a reset.</w:t>
+      </w:r>
+    </w:p>
+    <w:p>
+      <w:r>
+        <w:t>Users will provide their email address and click the link. If the email address is found</w:t>
+      </w:r>
+      <w:r>
+        <w:t xml:space="preserve"> for an active user</w:t>
+      </w:r>
+      <w:r>
+        <w:t>, an email is sent with:</w:t>
+      </w:r>
+    </w:p>
+    <w:p>
+      <w:pPr>
+        <w:pStyle w:val="ListParagraph"/>
+        <w:numPr>
+          <w:ilvl w:val="0"/>
+          <w:numId w:val="2"/>
+        </w:numPr>
+      </w:pPr>
+      <w:r>
+        <w:t>Their username.</w:t>
+      </w:r>
+    </w:p>
+    <w:p>
+      <w:pPr>
+        <w:pStyle w:val="ListParagraph"/>
+        <w:numPr>
+          <w:ilvl w:val="0"/>
+          <w:numId w:val="2"/>
+        </w:numPr>
+      </w:pPr>
+      <w:r>
+        <w:t>A link to reset their password.</w:t>
+      </w:r>
+      <w:r>
+        <w:t xml:space="preserve"> Note there is an expiry time on the link.</w:t>
+      </w:r>
+    </w:p>
+    <w:p>
+      <w:r>
+        <w:t xml:space="preserve">Clicking the </w:t>
+      </w:r>
+      <w:r>
+        <w:t>reset link will take them to a web page to allow them to enter a new password.</w:t>
+      </w:r>
+    </w:p>
+    <w:p/>
+    <w:p>
+      <w:pPr>
+        <w:pStyle w:val="Heading2"/>
+      </w:pPr>
+      <w:bookmarkStart w:id="6" w:name="_Toc234331599"/>
+      <w:r>
+        <w:t>Self-Registration (Signup)</w:t>
+      </w:r>
+      <w:bookmarkEnd w:id="6"/>
+    </w:p>
+    <w:p>
+      <w:r>
+        <w:t>New</w:t>
+      </w:r>
+      <w:r>
+        <w:t xml:space="preserve"> users</w:t>
+      </w:r>
+      <w:r>
+        <w:t xml:space="preserve"> can request access to the system:</w:t>
+      </w:r>
+    </w:p>
+    <w:p>
+      <w:pPr>
+        <w:pStyle w:val="ListParagraph"/>
+        <w:numPr>
+          <w:ilvl w:val="0"/>
+          <w:numId w:val="2"/>
+        </w:numPr>
+      </w:pPr>
+      <w:r>
+        <w:t>They open the login page and click the ‘Signup’ link.</w:t>
+      </w:r>
+    </w:p>
+    <w:p>
+      <w:pPr>
+        <w:pStyle w:val="ListParagraph"/>
+        <w:numPr>
+          <w:ilvl w:val="0"/>
+          <w:numId w:val="2"/>
+        </w:numPr>
+      </w:pPr>
+      <w:r>
+        <w:lastRenderedPageBreak/>
+        <w:t xml:space="preserve">A form requesting their chosen username, email and password is presented. </w:t>
+      </w:r>
+    </w:p>
+    <w:p>
+      <w:pPr>
+        <w:pStyle w:val="ListParagraph"/>
+        <w:numPr>
+          <w:ilvl w:val="0"/>
+          <w:numId w:val="2"/>
+        </w:numPr>
+      </w:pPr>
+      <w:r>
+        <w:t>Once the form is validated, an</w:t>
+      </w:r>
+      <w:r>
+        <w:t xml:space="preserve"> email is sent with a link to verify their email.</w:t>
+      </w:r>
+    </w:p>
+    <w:p>
+      <w:pPr>
+        <w:pStyle w:val="ListParagraph"/>
+        <w:numPr>
+          <w:ilvl w:val="0"/>
+          <w:numId w:val="2"/>
+        </w:numPr>
+      </w:pPr>
+      <w:r>
+        <w:t>Once the email is verified, they can login.</w:t>
+      </w:r>
+    </w:p>
+    <w:p/>
+    <w:p>
+      <w:pPr>
+        <w:pStyle w:val="Heading2"/>
+      </w:pPr>
+      <w:bookmarkStart w:id="7" w:name="_Toc234331600"/>
+      <w:r>
+        <w:t>Email Address Verification</w:t>
+      </w:r>
+      <w:bookmarkEnd w:id="7"/>
+    </w:p>
+    <w:p>
+      <w:r>
+        <w:t>U</w:t>
+      </w:r>
+      <w:r>
+        <w:t xml:space="preserve">sers can request </w:t>
+      </w:r>
+      <w:r>
+        <w:t>their email address to be verified</w:t>
+      </w:r>
+      <w:r>
+        <w:t>:</w:t>
+      </w:r>
+    </w:p>
+    <w:p>
+      <w:pPr>
+        <w:pStyle w:val="ListParagraph"/>
+        <w:numPr>
+          <w:ilvl w:val="0"/>
+          <w:numId w:val="2"/>
+        </w:numPr>
+      </w:pPr>
+      <w:r>
+        <w:t>They open the login page and click the ‘</w:t>
+      </w:r>
+      <w:r>
+        <w:t>Verify Email Address</w:t>
+      </w:r>
+      <w:r>
+        <w:t>’ link.</w:t>
+      </w:r>
+    </w:p>
+    <w:p>
+      <w:pPr>
+        <w:pStyle w:val="ListParagraph"/>
+        <w:numPr>
+          <w:ilvl w:val="0"/>
+          <w:numId w:val="2"/>
+        </w:numPr>
+      </w:pPr>
+      <w:r>
+        <w:t xml:space="preserve">A form requesting their email is presented. </w:t>
+      </w:r>
+    </w:p>
+    <w:p>
+      <w:pPr>
+        <w:pStyle w:val="ListParagraph"/>
+        <w:numPr>
+          <w:ilvl w:val="0"/>
+          <w:numId w:val="2"/>
+        </w:numPr>
+      </w:pPr>
+      <w:r>
+        <w:t xml:space="preserve">Once the form is validated, </w:t>
+      </w:r>
+      <w:r>
+        <w:t>the</w:t>
+      </w:r>
+      <w:r>
+        <w:t xml:space="preserve"> email </w:t>
+      </w:r>
+      <w:r>
+        <w:t>address will be recorded as verified.</w:t>
+      </w:r>
+    </w:p>
+    <w:p>
+      <w:pPr>
+        <w:pStyle w:val="ListParagraph"/>
+        <w:numPr>
+          <w:ilvl w:val="0"/>
+          <w:numId w:val="2"/>
+        </w:numPr>
+      </w:pPr>
+      <w:r>
+        <w:t xml:space="preserve">If the Org enforces email verification, </w:t>
+      </w:r>
+      <w:r>
+        <w:t>they can login.</w:t>
+      </w:r>
+    </w:p>
+    <w:p/>
+    <w:p>
+      <w:pPr>
+        <w:pStyle w:val="Heading1"/>
+        <w:spacing w:before="400" w:after="40" w:line="240" w:lineRule="auto"/>
+      </w:pPr>
+      <w:bookmarkStart w:id="8" w:name="_Toc234331601"/>
+      <w:r>
+        <w:rPr>
+          <w:color w:val="0A2F41" w:themeColor="accent1" w:themeShade="80"/>
+          <w:kern w:val="0"/>
+          <w:sz w:val="36"/>
+          <w:szCs w:val="36"/>
+          <w:u w:val="single"/>
+          <w14:ligatures w14:val="none"/>
+        </w:rPr>
         <w:t>Authentication</w:t>
+      </w:r>
+      <w:bookmarkEnd w:id="8"/>
+      <w:r>
+        <w:rPr>
+          <w:color w:val="0A2F41" w:themeColor="accent1" w:themeShade="80"/>
+          <w:kern w:val="0"/>
+          <w:sz w:val="36"/>
+          <w:szCs w:val="36"/>
+          <w:u w:val="single"/>
+          <w14:ligatures w14:val="none"/>
+        </w:rPr>
+        <w:t xml:space="preserve"> (delete me)</w:t>
       </w:r>
     </w:p>
     <w:p>
@@ -124,14 +1504,12 @@
       <w:r>
         <w:t xml:space="preserve">into the application. If configured, the user can choose the organisation and language they want to login to (otherwise the default is used as specified in the </w:t>
       </w:r>
-      <w:proofErr w:type="gramStart"/>
       <w:r>
         <w:rPr>
           <w:rFonts w:ascii="Courier New" w:hAnsi="Courier New" w:cs="Courier New"/>
         </w:rPr>
         <w:t>cntrl.loginoption</w:t>
       </w:r>
-      <w:proofErr w:type="gramEnd"/>
       <w:r>
         <w:t xml:space="preserve"> table).</w:t>
       </w:r>
@@ -213,14 +1591,12 @@
       <w:r>
         <w:t>The Backend API returns a token key for successful logins. The user is then forwarded (</w:t>
       </w:r>
-      <w:proofErr w:type="spellStart"/>
       <w:r>
         <w:rPr>
           <w:rFonts w:ascii="Courier New" w:hAnsi="Courier New" w:cs="Courier New"/>
         </w:rPr>
         <w:t>NavigateTo</w:t>
       </w:r>
-      <w:proofErr w:type="spellEnd"/>
       <w:r>
         <w:t>) to FrontendServer project. This is the actual web client. The forwarding URL is given a fragment that contains the token key.</w:t>
       </w:r>
@@ -269,14 +1645,12 @@
       <w:r>
         <w:t xml:space="preserve">If configured (i.e. the </w:t>
       </w:r>
-      <w:proofErr w:type="gramStart"/>
       <w:r>
         <w:rPr>
           <w:rFonts w:ascii="Courier New" w:hAnsi="Courier New" w:cs="Courier New"/>
         </w:rPr>
         <w:t>cntrl.loginoption</w:t>
       </w:r>
-      <w:proofErr w:type="gramEnd"/>
       <w:r>
         <w:t xml:space="preserve"> is flagged as external) then the user is returned the token. They can then use this in their API calls.</w:t>
       </w:r>
@@ -314,8 +1688,12 @@
         </w:numPr>
       </w:pPr>
       <w:r>
+        <w:lastRenderedPageBreak/>
         <w:t>Mostly like a direct API call to the Backend API login process.</w:t>
       </w:r>
+    </w:p>
+    <w:p/>
+    <w:p>
       <w:r>
         <w:br/>
       </w:r>
@@ -344,316 +1722,8 @@
         <w:br w:type="page"/>
       </w:r>
     </w:p>
-    <w:p>
-      <w:pPr>
-        <w:pStyle w:val="Heading1"/>
-        <w:spacing w:before="400" w:after="40" w:line="240" w:lineRule="auto"/>
-      </w:pPr>
-      <w:r>
-        <w:rPr>
-          <w:color w:val="0A2F41" w:themeColor="accent1" w:themeShade="80"/>
-          <w:kern w:val="0"/>
-          <w:sz w:val="36"/>
-          <w:szCs w:val="36"/>
-          <w:u w:val="single"/>
-          <w14:ligatures w14:val="none"/>
-        </w:rPr>
-        <w:lastRenderedPageBreak/>
-        <w:t>Authorisation</w:t>
-      </w:r>
-    </w:p>
-    <w:p>
-      <w:pPr>
-        <w:rPr>
-          <w:i/>
-          <w:iCs/>
-        </w:rPr>
-      </w:pPr>
-      <w:r>
-        <w:rPr>
-          <w:i/>
-          <w:iCs/>
-        </w:rPr>
-        <w:t>What are you allowed to do?</w:t>
-      </w:r>
-    </w:p>
-    <w:p>
-      <w:r>
-        <w:t xml:space="preserve">Only the Backend API controllers contain authorisation controls. Services and Repositories </w:t>
-      </w:r>
-      <w:r>
-        <w:t>are not checked for authorisation. Note these are not exposed outside the application.</w:t>
-      </w:r>
-    </w:p>
-    <w:p>
-      <w:r>
-        <w:t>Note that the FrontendServer app will check a user’s permissions to either show/hide objects in the page. However, the Backend API does not trust clients and therefore will always check and validate actions.</w:t>
-      </w:r>
-    </w:p>
-    <w:p>
-      <w:r>
-        <w:t xml:space="preserve">API controllers and their REST methods are </w:t>
-      </w:r>
-      <w:r>
-        <w:t>configured with</w:t>
-      </w:r>
-      <w:r>
-        <w:t xml:space="preserve"> permissions and CRUD</w:t>
-      </w:r>
-      <w:r>
-        <w:t xml:space="preserve"> values</w:t>
-      </w:r>
-      <w:r>
-        <w:t>. Users have roles that contain permissions</w:t>
-      </w:r>
-      <w:r>
-        <w:t xml:space="preserve"> with an associated CRUD value</w:t>
-      </w:r>
-      <w:r>
-        <w:t xml:space="preserve">. </w:t>
-      </w:r>
-    </w:p>
-    <w:p>
-      <w:r>
-        <w:t>The details are:</w:t>
-      </w:r>
-    </w:p>
-    <w:p>
-      <w:pPr>
-        <w:pStyle w:val="ListParagraph"/>
-        <w:numPr>
-          <w:ilvl w:val="0"/>
-          <w:numId w:val="1"/>
-        </w:numPr>
-      </w:pPr>
-      <w:r>
-        <w:t>Permissions are hard coded. They have a unique number for identification.</w:t>
-      </w:r>
-    </w:p>
-    <w:p>
-      <w:pPr>
-        <w:pStyle w:val="ListParagraph"/>
-        <w:numPr>
-          <w:ilvl w:val="0"/>
-          <w:numId w:val="1"/>
-        </w:numPr>
-      </w:pPr>
-      <w:r>
-        <w:t xml:space="preserve">Backend API controllers are annotated with </w:t>
-      </w:r>
-      <w:proofErr w:type="spellStart"/>
-      <w:proofErr w:type="gramStart"/>
-      <w:r>
-        <w:rPr>
-          <w:rFonts w:ascii="Courier New" w:hAnsi="Courier New" w:cs="Courier New"/>
-        </w:rPr>
-        <w:t>PermissionAtt</w:t>
-      </w:r>
-      <w:proofErr w:type="spellEnd"/>
-      <w:r>
-        <w:rPr>
-          <w:rFonts w:ascii="Courier New" w:hAnsi="Courier New" w:cs="Courier New"/>
-        </w:rPr>
-        <w:t>(</w:t>
-      </w:r>
-      <w:proofErr w:type="gramEnd"/>
-      <w:r>
-        <w:rPr>
-          <w:rFonts w:ascii="Courier New" w:hAnsi="Courier New" w:cs="Courier New"/>
-        </w:rPr>
-        <w:t>Permission Nr</w:t>
-      </w:r>
-      <w:r>
-        <w:rPr>
-          <w:rFonts w:ascii="Courier New" w:hAnsi="Courier New" w:cs="Courier New"/>
-        </w:rPr>
-        <w:t>)</w:t>
-      </w:r>
-      <w:r>
-        <w:t xml:space="preserve"> at the class level.</w:t>
-      </w:r>
-      <w:r>
-        <w:t xml:space="preserve"> Each method within the class is annotated with a CRUD attribute </w:t>
-      </w:r>
-      <w:proofErr w:type="spellStart"/>
-      <w:proofErr w:type="gramStart"/>
-      <w:r>
-        <w:rPr>
-          <w:rFonts w:ascii="Courier New" w:hAnsi="Courier New" w:cs="Courier New"/>
-        </w:rPr>
-        <w:t>CrudAtt</w:t>
-      </w:r>
-      <w:proofErr w:type="spellEnd"/>
-      <w:r>
-        <w:rPr>
-          <w:rFonts w:ascii="Courier New" w:hAnsi="Courier New" w:cs="Courier New"/>
-        </w:rPr>
-        <w:t>(</w:t>
-      </w:r>
-      <w:proofErr w:type="gramEnd"/>
-      <w:r>
-        <w:rPr>
-          <w:rFonts w:ascii="Courier New" w:hAnsi="Courier New" w:cs="Courier New"/>
-        </w:rPr>
-        <w:t>Crud</w:t>
-      </w:r>
-      <w:r>
-        <w:rPr>
-          <w:rFonts w:ascii="Courier New" w:hAnsi="Courier New" w:cs="Courier New"/>
-        </w:rPr>
-        <w:t xml:space="preserve"> Value</w:t>
-      </w:r>
-      <w:r>
-        <w:rPr>
-          <w:rFonts w:ascii="Courier New" w:hAnsi="Courier New" w:cs="Courier New"/>
-        </w:rPr>
-        <w:t>)</w:t>
-      </w:r>
-      <w:r>
-        <w:t>.</w:t>
-      </w:r>
-    </w:p>
-    <w:p>
-      <w:pPr>
-        <w:pStyle w:val="ListParagraph"/>
-        <w:numPr>
-          <w:ilvl w:val="0"/>
-          <w:numId w:val="1"/>
-        </w:numPr>
-      </w:pPr>
-      <w:proofErr w:type="spellStart"/>
-      <w:r>
-        <w:t>Crud</w:t>
-      </w:r>
-      <w:proofErr w:type="spellEnd"/>
-      <w:r>
-        <w:t xml:space="preserve"> Values are</w:t>
-      </w:r>
-      <w:r>
-        <w:t xml:space="preserve"> hard coded. The possible values are</w:t>
-      </w:r>
-      <w:r>
-        <w:t>:</w:t>
-      </w:r>
-      <w:r>
-        <w:br/>
-        <w:t>Create – used when creating records</w:t>
-      </w:r>
-      <w:r>
-        <w:br/>
-        <w:t>Read – used to read records</w:t>
-      </w:r>
-      <w:r>
-        <w:br/>
-        <w:t>Update – used to edit records</w:t>
-      </w:r>
-      <w:r>
-        <w:br/>
-        <w:t>Delete – used to delete records</w:t>
-      </w:r>
-      <w:r>
-        <w:br/>
-      </w:r>
-      <w:proofErr w:type="spellStart"/>
-      <w:r>
-        <w:t>ReadList</w:t>
-      </w:r>
-      <w:proofErr w:type="spellEnd"/>
-      <w:r>
-        <w:t xml:space="preserve"> – used to display bulk information in lists (not the complete record)</w:t>
-      </w:r>
-      <w:r>
-        <w:br/>
-        <w:t>Ignore – permission is available to any user</w:t>
-      </w:r>
-    </w:p>
-    <w:p>
-      <w:pPr>
-        <w:pStyle w:val="ListParagraph"/>
-        <w:numPr>
-          <w:ilvl w:val="0"/>
-          <w:numId w:val="1"/>
-        </w:numPr>
-      </w:pPr>
-      <w:r>
-        <w:t xml:space="preserve">Roles are created </w:t>
-      </w:r>
-      <w:r>
-        <w:t>and maintained in the application. Each role can be assigned one or more permissions along with CRUD values for that permission.</w:t>
-      </w:r>
-    </w:p>
-    <w:p>
-      <w:pPr>
-        <w:pStyle w:val="ListParagraph"/>
-        <w:numPr>
-          <w:ilvl w:val="0"/>
-          <w:numId w:val="1"/>
-        </w:numPr>
-      </w:pPr>
-      <w:r>
-        <w:t>Users are created for authentication, i.e. user id and password.</w:t>
-      </w:r>
-    </w:p>
-    <w:p>
-      <w:pPr>
-        <w:pStyle w:val="ListParagraph"/>
-        <w:numPr>
-          <w:ilvl w:val="0"/>
-          <w:numId w:val="1"/>
-        </w:numPr>
-      </w:pPr>
-      <w:r>
-        <w:t>Users have accounts (access to an organisation</w:t>
-      </w:r>
-      <w:r>
-        <w:t xml:space="preserve"> requires a unique user account</w:t>
-      </w:r>
-      <w:r>
-        <w:t>).</w:t>
-      </w:r>
-    </w:p>
-    <w:p>
-      <w:pPr>
-        <w:pStyle w:val="ListParagraph"/>
-        <w:numPr>
-          <w:ilvl w:val="0"/>
-          <w:numId w:val="1"/>
-        </w:numPr>
-      </w:pPr>
-      <w:r>
-        <w:t xml:space="preserve">User accounts are assigned roles. </w:t>
-      </w:r>
-    </w:p>
-    <w:p>
-      <w:pPr>
-        <w:pStyle w:val="ListParagraph"/>
-        <w:numPr>
-          <w:ilvl w:val="0"/>
-          <w:numId w:val="1"/>
-        </w:numPr>
-      </w:pPr>
-      <w:r>
-        <w:t>When a user logs into an organisation the system will calculate the effective permissions and CRUD values for the session.</w:t>
-      </w:r>
-    </w:p>
-    <w:p>
-      <w:pPr>
-        <w:pStyle w:val="ListParagraph"/>
-        <w:numPr>
-          <w:ilvl w:val="0"/>
-          <w:numId w:val="1"/>
-        </w:numPr>
-      </w:pPr>
-      <w:r>
-        <w:t>When an API REST method is called, the user’s session is validated for the REST’s permission and CRUD attribute.</w:t>
-      </w:r>
-    </w:p>
-    <w:p/>
-    <w:p/>
-    <w:p/>
-    <w:p/>
     <w:sectPr>
-      <w:footerReference w:type="default" r:id="rId7"/>
+      <w:footerReference w:type="default" r:id="rId8"/>
       <w:pgSz w:w="11906" w:h="16838"/>
       <w:pgMar w:top="1440" w:right="1440" w:bottom="1440" w:left="1440" w:header="708" w:footer="708" w:gutter="0"/>
       <w:cols w:space="708"/>
@@ -696,13 +1766,19 @@
       <w:pStyle w:val="Footer"/>
     </w:pPr>
     <w:r>
-      <w:ptab w:relativeTo="margin" w:alignment="left" w:leader="none"/>
+      <w:t>Login</w:t>
     </w:r>
     <w:r>
-      <w:t xml:space="preserve">Authentication and Authorisation </w:t>
+      <w:t xml:space="preserve"> </w:t>
     </w:r>
     <w:r>
-      <w:t>June 2026</w:t>
+      <w:t>Ju</w:t>
+    </w:r>
+    <w:r>
+      <w:t>ly</w:t>
+    </w:r>
+    <w:r>
+      <w:t xml:space="preserve"> 2026</w:t>
     </w:r>
     <w:r>
       <w:ptab w:relativeTo="margin" w:alignment="right" w:leader="none"/>
@@ -928,8 +2004,124 @@
       </w:rPr>
     </w:lvl>
   </w:abstractNum>
+  <w:abstractNum w:abstractNumId="1" w15:restartNumberingAfterBreak="0">
+    <w:nsid w:val="59AA1A49"/>
+    <w:multiLevelType w:val="hybridMultilevel"/>
+    <w:tmpl w:val="9B0CBE52"/>
+    <w:lvl w:ilvl="0" w:tplc="1200CF48">
+      <w:start w:val="2"/>
+      <w:numFmt w:val="bullet"/>
+      <w:lvlText w:val="-"/>
+      <w:lvlJc w:val="left"/>
+      <w:pPr>
+        <w:ind w:left="720" w:hanging="360"/>
+      </w:pPr>
+      <w:rPr>
+        <w:rFonts w:ascii="Aptos" w:eastAsiaTheme="minorHAnsi" w:hAnsi="Aptos" w:cstheme="minorBidi" w:hint="default"/>
+      </w:rPr>
+    </w:lvl>
+    <w:lvl w:ilvl="1" w:tplc="14090003" w:tentative="1">
+      <w:start w:val="1"/>
+      <w:numFmt w:val="bullet"/>
+      <w:lvlText w:val="o"/>
+      <w:lvlJc w:val="left"/>
+      <w:pPr>
+        <w:ind w:left="1440" w:hanging="360"/>
+      </w:pPr>
+      <w:rPr>
+        <w:rFonts w:ascii="Courier New" w:hAnsi="Courier New" w:cs="Courier New" w:hint="default"/>
+      </w:rPr>
+    </w:lvl>
+    <w:lvl w:ilvl="2" w:tplc="14090005" w:tentative="1">
+      <w:start w:val="1"/>
+      <w:numFmt w:val="bullet"/>
+      <w:lvlText w:val=""/>
+      <w:lvlJc w:val="left"/>
+      <w:pPr>
+        <w:ind w:left="2160" w:hanging="360"/>
+      </w:pPr>
+      <w:rPr>
+        <w:rFonts w:ascii="Wingdings" w:hAnsi="Wingdings" w:hint="default"/>
+      </w:rPr>
+    </w:lvl>
+    <w:lvl w:ilvl="3" w:tplc="14090001" w:tentative="1">
+      <w:start w:val="1"/>
+      <w:numFmt w:val="bullet"/>
+      <w:lvlText w:val=""/>
+      <w:lvlJc w:val="left"/>
+      <w:pPr>
+        <w:ind w:left="2880" w:hanging="360"/>
+      </w:pPr>
+      <w:rPr>
+        <w:rFonts w:ascii="Symbol" w:hAnsi="Symbol" w:hint="default"/>
+      </w:rPr>
+    </w:lvl>
+    <w:lvl w:ilvl="4" w:tplc="14090003" w:tentative="1">
+      <w:start w:val="1"/>
+      <w:numFmt w:val="bullet"/>
+      <w:lvlText w:val="o"/>
+      <w:lvlJc w:val="left"/>
+      <w:pPr>
+        <w:ind w:left="3600" w:hanging="360"/>
+      </w:pPr>
+      <w:rPr>
+        <w:rFonts w:ascii="Courier New" w:hAnsi="Courier New" w:cs="Courier New" w:hint="default"/>
+      </w:rPr>
+    </w:lvl>
+    <w:lvl w:ilvl="5" w:tplc="14090005" w:tentative="1">
+      <w:start w:val="1"/>
+      <w:numFmt w:val="bullet"/>
+      <w:lvlText w:val=""/>
+      <w:lvlJc w:val="left"/>
+      <w:pPr>
+        <w:ind w:left="4320" w:hanging="360"/>
+      </w:pPr>
+      <w:rPr>
+        <w:rFonts w:ascii="Wingdings" w:hAnsi="Wingdings" w:hint="default"/>
+      </w:rPr>
+    </w:lvl>
+    <w:lvl w:ilvl="6" w:tplc="14090001" w:tentative="1">
+      <w:start w:val="1"/>
+      <w:numFmt w:val="bullet"/>
+      <w:lvlText w:val=""/>
+      <w:lvlJc w:val="left"/>
+      <w:pPr>
+        <w:ind w:left="5040" w:hanging="360"/>
+      </w:pPr>
+      <w:rPr>
+        <w:rFonts w:ascii="Symbol" w:hAnsi="Symbol" w:hint="default"/>
+      </w:rPr>
+    </w:lvl>
+    <w:lvl w:ilvl="7" w:tplc="14090003" w:tentative="1">
+      <w:start w:val="1"/>
+      <w:numFmt w:val="bullet"/>
+      <w:lvlText w:val="o"/>
+      <w:lvlJc w:val="left"/>
+      <w:pPr>
+        <w:ind w:left="5760" w:hanging="360"/>
+      </w:pPr>
+      <w:rPr>
+        <w:rFonts w:ascii="Courier New" w:hAnsi="Courier New" w:cs="Courier New" w:hint="default"/>
+      </w:rPr>
+    </w:lvl>
+    <w:lvl w:ilvl="8" w:tplc="14090005" w:tentative="1">
+      <w:start w:val="1"/>
+      <w:numFmt w:val="bullet"/>
+      <w:lvlText w:val=""/>
+      <w:lvlJc w:val="left"/>
+      <w:pPr>
+        <w:ind w:left="6480" w:hanging="360"/>
+      </w:pPr>
+      <w:rPr>
+        <w:rFonts w:ascii="Wingdings" w:hAnsi="Wingdings" w:hint="default"/>
+      </w:rPr>
+    </w:lvl>
+  </w:abstractNum>
   <w:num w:numId="1" w16cid:durableId="766459962">
     <w:abstractNumId w:val="0"/>
+  </w:num>
+  <w:num w:numId="2" w16cid:durableId="920873350">
+    <w:abstractNumId w:val="1"/>
   </w:num>
 </w:numbering>
 </file>
@@ -1362,7 +2554,6 @@
     <w:next w:val="Normal"/>
     <w:link w:val="Heading2Char"/>
     <w:uiPriority w:val="9"/>
-    <w:semiHidden/>
     <w:unhideWhenUsed/>
     <w:qFormat/>
     <w:rsid w:val="00FE297A"/>
@@ -1579,7 +2770,6 @@
     <w:basedOn w:val="DefaultParagraphFont"/>
     <w:link w:val="Heading2"/>
     <w:uiPriority w:val="9"/>
-    <w:semiHidden/>
     <w:rsid w:val="00FE297A"/>
     <w:rPr>
       <w:rFonts w:asciiTheme="majorHAnsi" w:eastAsiaTheme="majorEastAsia" w:hAnsiTheme="majorHAnsi" w:cstheme="majorBidi"/>
@@ -1894,6 +3084,62 @@
     <w:link w:val="Footer"/>
     <w:uiPriority w:val="99"/>
     <w:rsid w:val="006C31CF"/>
+  </w:style>
+  <w:style w:type="paragraph" w:styleId="TOCHeading">
+    <w:name w:val="TOC Heading"/>
+    <w:basedOn w:val="Heading1"/>
+    <w:next w:val="Normal"/>
+    <w:uiPriority w:val="39"/>
+    <w:unhideWhenUsed/>
+    <w:qFormat/>
+    <w:rsid w:val="006C060D"/>
+    <w:pPr>
+      <w:spacing w:before="240" w:after="0" w:line="259" w:lineRule="auto"/>
+      <w:outlineLvl w:val="9"/>
+    </w:pPr>
+    <w:rPr>
+      <w:kern w:val="0"/>
+      <w:sz w:val="32"/>
+      <w:szCs w:val="32"/>
+      <w:lang w:val="en-US"/>
+      <w14:ligatures w14:val="none"/>
+    </w:rPr>
+  </w:style>
+  <w:style w:type="paragraph" w:styleId="TOC1">
+    <w:name w:val="toc 1"/>
+    <w:basedOn w:val="Normal"/>
+    <w:next w:val="Normal"/>
+    <w:autoRedefine/>
+    <w:uiPriority w:val="39"/>
+    <w:unhideWhenUsed/>
+    <w:rsid w:val="006C060D"/>
+    <w:pPr>
+      <w:spacing w:after="100"/>
+    </w:pPr>
+  </w:style>
+  <w:style w:type="paragraph" w:styleId="TOC2">
+    <w:name w:val="toc 2"/>
+    <w:basedOn w:val="Normal"/>
+    <w:next w:val="Normal"/>
+    <w:autoRedefine/>
+    <w:uiPriority w:val="39"/>
+    <w:unhideWhenUsed/>
+    <w:rsid w:val="006C060D"/>
+    <w:pPr>
+      <w:spacing w:after="100"/>
+      <w:ind w:left="240"/>
+    </w:pPr>
+  </w:style>
+  <w:style w:type="character" w:styleId="Hyperlink">
+    <w:name w:val="Hyperlink"/>
+    <w:basedOn w:val="DefaultParagraphFont"/>
+    <w:uiPriority w:val="99"/>
+    <w:unhideWhenUsed/>
+    <w:rsid w:val="006C060D"/>
+    <w:rPr>
+      <w:color w:val="467886" w:themeColor="hyperlink"/>
+      <w:u w:val="single"/>
+    </w:rPr>
   </w:style>
 </w:styles>
 </file>
@@ -2211,4 +3457,16 @@
     </a:ext>
   </a:extLst>
 </a:theme>
+</file>
+
+<file path=customXml/item1.xml><?xml version="1.0" encoding="utf-8"?>
+<b:Sources xmlns:b="http://schemas.openxmlformats.org/officeDocument/2006/bibliography" xmlns="http://schemas.openxmlformats.org/officeDocument/2006/bibliography" SelectedStyle="\APASixthEditionOfficeOnline.xsl" StyleName="APA" Version="6"/>
+</file>
+
+<file path=customXml/itemProps1.xml><?xml version="1.0" encoding="utf-8"?>
+<ds:datastoreItem xmlns:ds="http://schemas.openxmlformats.org/officeDocument/2006/customXml" ds:itemID="{AF9C8DE2-F9A6-49D9-B341-8327D230E92B}">
+  <ds:schemaRefs>
+    <ds:schemaRef ds:uri="http://schemas.openxmlformats.org/officeDocument/2006/bibliography"/>
+  </ds:schemaRefs>
+</ds:datastoreItem>
 </file>
</xml_diff>

<commit_message>
mfa and tidy up
</commit_message>
<xml_diff>
--- a/docs/Login.docx
+++ b/docs/Login.docx
@@ -81,6 +81,15 @@
     <w:p/>
     <w:sdt>
       <w:sdtPr>
+        <w:rPr>
+          <w:rFonts w:asciiTheme="minorHAnsi" w:eastAsiaTheme="minorHAnsi" w:hAnsiTheme="minorHAnsi" w:cstheme="minorBidi"/>
+          <w:color w:val="auto"/>
+          <w:kern w:val="2"/>
+          <w:sz w:val="24"/>
+          <w:szCs w:val="24"/>
+          <w:lang w:val="en-NZ"/>
+          <w14:ligatures w14:val="standardContextual"/>
+        </w:rPr>
         <w:id w:val="-482388924"/>
         <w:docPartObj>
           <w:docPartGallery w:val="Table of Contents"/>
@@ -89,16 +98,9 @@
       </w:sdtPr>
       <w:sdtEndPr>
         <w:rPr>
-          <w:rFonts w:asciiTheme="minorHAnsi" w:eastAsiaTheme="minorHAnsi" w:hAnsiTheme="minorHAnsi" w:cstheme="minorBidi"/>
           <w:b/>
           <w:bCs/>
           <w:noProof/>
-          <w:color w:val="auto"/>
-          <w:kern w:val="2"/>
-          <w:sz w:val="24"/>
-          <w:szCs w:val="24"/>
-          <w:lang w:val="en-NZ"/>
-          <w14:ligatures w14:val="standardContextual"/>
         </w:rPr>
       </w:sdtEndPr>
       <w:sdtContent>
@@ -117,7 +119,9 @@
               <w:tab w:val="right" w:leader="dot" w:pos="9016"/>
             </w:tabs>
             <w:rPr>
+              <w:rFonts w:eastAsiaTheme="minorEastAsia"/>
               <w:noProof/>
+              <w:lang w:eastAsia="en-NZ"/>
             </w:rPr>
           </w:pPr>
           <w:r>
@@ -129,7 +133,7 @@
           <w:r>
             <w:fldChar w:fldCharType="separate"/>
           </w:r>
-          <w:hyperlink w:anchor="_Toc234331593" w:history="1">
+          <w:hyperlink w:anchor="_Toc234498512" w:history="1">
             <w:r>
               <w:rPr>
                 <w:rStyle w:val="Hyperlink"/>
@@ -158,7 +162,7 @@
                 <w:noProof/>
                 <w:webHidden/>
               </w:rPr>
-              <w:instrText xml:space="preserve"> PAGEREF _Toc234331593 \h </w:instrText>
+              <w:instrText xml:space="preserve"> PAGEREF _Toc234498512 \h </w:instrText>
             </w:r>
             <w:r>
               <w:rPr>
@@ -196,10 +200,12 @@
               <w:tab w:val="right" w:leader="dot" w:pos="9016"/>
             </w:tabs>
             <w:rPr>
+              <w:rFonts w:eastAsiaTheme="minorEastAsia"/>
               <w:noProof/>
+              <w:lang w:eastAsia="en-NZ"/>
             </w:rPr>
           </w:pPr>
-          <w:hyperlink w:anchor="_Toc234331594" w:history="1">
+          <w:hyperlink w:anchor="_Toc234498513" w:history="1">
             <w:r>
               <w:rPr>
                 <w:rStyle w:val="Hyperlink"/>
@@ -226,7 +232,7 @@
                 <w:noProof/>
                 <w:webHidden/>
               </w:rPr>
-              <w:instrText xml:space="preserve"> PAGEREF _Toc234331594 \h </w:instrText>
+              <w:instrText xml:space="preserve"> PAGEREF _Toc234498513 \h </w:instrText>
             </w:r>
             <w:r>
               <w:rPr>
@@ -264,10 +270,12 @@
               <w:tab w:val="right" w:leader="dot" w:pos="9016"/>
             </w:tabs>
             <w:rPr>
+              <w:rFonts w:eastAsiaTheme="minorEastAsia"/>
               <w:noProof/>
+              <w:lang w:eastAsia="en-NZ"/>
             </w:rPr>
           </w:pPr>
-          <w:hyperlink w:anchor="_Toc234331595" w:history="1">
+          <w:hyperlink w:anchor="_Toc234498514" w:history="1">
             <w:r>
               <w:rPr>
                 <w:rStyle w:val="Hyperlink"/>
@@ -294,7 +302,7 @@
                 <w:noProof/>
                 <w:webHidden/>
               </w:rPr>
-              <w:instrText xml:space="preserve"> PAGEREF _Toc234331595 \h </w:instrText>
+              <w:instrText xml:space="preserve"> PAGEREF _Toc234498514 \h </w:instrText>
             </w:r>
             <w:r>
               <w:rPr>
@@ -332,10 +340,12 @@
               <w:tab w:val="right" w:leader="dot" w:pos="9016"/>
             </w:tabs>
             <w:rPr>
+              <w:rFonts w:eastAsiaTheme="minorEastAsia"/>
               <w:noProof/>
+              <w:lang w:eastAsia="en-NZ"/>
             </w:rPr>
           </w:pPr>
-          <w:hyperlink w:anchor="_Toc234331596" w:history="1">
+          <w:hyperlink w:anchor="_Toc234498515" w:history="1">
             <w:r>
               <w:rPr>
                 <w:rStyle w:val="Hyperlink"/>
@@ -362,7 +372,7 @@
                 <w:noProof/>
                 <w:webHidden/>
               </w:rPr>
-              <w:instrText xml:space="preserve"> PAGEREF _Toc234331596 \h </w:instrText>
+              <w:instrText xml:space="preserve"> PAGEREF _Toc234498515 \h </w:instrText>
             </w:r>
             <w:r>
               <w:rPr>
@@ -400,16 +410,18 @@
               <w:tab w:val="right" w:leader="dot" w:pos="9016"/>
             </w:tabs>
             <w:rPr>
+              <w:rFonts w:eastAsiaTheme="minorEastAsia"/>
               <w:noProof/>
+              <w:lang w:eastAsia="en-NZ"/>
             </w:rPr>
           </w:pPr>
-          <w:hyperlink w:anchor="_Toc234331597" w:history="1">
+          <w:hyperlink w:anchor="_Toc234498516" w:history="1">
             <w:r>
               <w:rPr>
                 <w:rStyle w:val="Hyperlink"/>
                 <w:noProof/>
               </w:rPr>
-              <w:t>MFA</w:t>
+              <w:t>Lock Outs</w:t>
             </w:r>
             <w:r>
               <w:rPr>
@@ -430,7 +442,7 @@
                 <w:noProof/>
                 <w:webHidden/>
               </w:rPr>
-              <w:instrText xml:space="preserve"> PAGEREF _Toc234331597 \h </w:instrText>
+              <w:instrText xml:space="preserve"> PAGEREF _Toc234498516 \h </w:instrText>
             </w:r>
             <w:r>
               <w:rPr>
@@ -468,16 +480,18 @@
               <w:tab w:val="right" w:leader="dot" w:pos="9016"/>
             </w:tabs>
             <w:rPr>
+              <w:rFonts w:eastAsiaTheme="minorEastAsia"/>
               <w:noProof/>
+              <w:lang w:eastAsia="en-NZ"/>
             </w:rPr>
           </w:pPr>
-          <w:hyperlink w:anchor="_Toc234331598" w:history="1">
+          <w:hyperlink w:anchor="_Toc234498517" w:history="1">
             <w:r>
               <w:rPr>
                 <w:rStyle w:val="Hyperlink"/>
                 <w:noProof/>
               </w:rPr>
-              <w:t>Forgot Username / Password</w:t>
+              <w:t>MFA</w:t>
             </w:r>
             <w:r>
               <w:rPr>
@@ -498,7 +512,7 @@
                 <w:noProof/>
                 <w:webHidden/>
               </w:rPr>
-              <w:instrText xml:space="preserve"> PAGEREF _Toc234331598 \h </w:instrText>
+              <w:instrText xml:space="preserve"> PAGEREF _Toc234498517 \h </w:instrText>
             </w:r>
             <w:r>
               <w:rPr>
@@ -536,16 +550,18 @@
               <w:tab w:val="right" w:leader="dot" w:pos="9016"/>
             </w:tabs>
             <w:rPr>
+              <w:rFonts w:eastAsiaTheme="minorEastAsia"/>
               <w:noProof/>
+              <w:lang w:eastAsia="en-NZ"/>
             </w:rPr>
           </w:pPr>
-          <w:hyperlink w:anchor="_Toc234331599" w:history="1">
+          <w:hyperlink w:anchor="_Toc234498518" w:history="1">
             <w:r>
               <w:rPr>
                 <w:rStyle w:val="Hyperlink"/>
                 <w:noProof/>
               </w:rPr>
-              <w:t>Self-Registration (Signup)</w:t>
+              <w:t>Forgot Username / Password</w:t>
             </w:r>
             <w:r>
               <w:rPr>
@@ -566,7 +582,7 @@
                 <w:noProof/>
                 <w:webHidden/>
               </w:rPr>
-              <w:instrText xml:space="preserve"> PAGEREF _Toc234331599 \h </w:instrText>
+              <w:instrText xml:space="preserve"> PAGEREF _Toc234498518 \h </w:instrText>
             </w:r>
             <w:r>
               <w:rPr>
@@ -586,7 +602,7 @@
                 <w:noProof/>
                 <w:webHidden/>
               </w:rPr>
-              <w:t>3</w:t>
+              <w:t>4</w:t>
             </w:r>
             <w:r>
               <w:rPr>
@@ -604,15 +620,87 @@
               <w:tab w:val="right" w:leader="dot" w:pos="9016"/>
             </w:tabs>
             <w:rPr>
+              <w:rFonts w:eastAsiaTheme="minorEastAsia"/>
               <w:noProof/>
+              <w:lang w:eastAsia="en-NZ"/>
             </w:rPr>
           </w:pPr>
-          <w:hyperlink w:anchor="_Toc234331600" w:history="1">
+          <w:hyperlink w:anchor="_Toc234498519" w:history="1">
             <w:r>
               <w:rPr>
                 <w:rStyle w:val="Hyperlink"/>
                 <w:noProof/>
               </w:rPr>
+              <w:t>Self-Registration (Signup)</w:t>
+            </w:r>
+            <w:r>
+              <w:rPr>
+                <w:noProof/>
+                <w:webHidden/>
+              </w:rPr>
+              <w:tab/>
+            </w:r>
+            <w:r>
+              <w:rPr>
+                <w:noProof/>
+                <w:webHidden/>
+              </w:rPr>
+              <w:fldChar w:fldCharType="begin"/>
+            </w:r>
+            <w:r>
+              <w:rPr>
+                <w:noProof/>
+                <w:webHidden/>
+              </w:rPr>
+              <w:instrText xml:space="preserve"> PAGEREF _Toc234498519 \h </w:instrText>
+            </w:r>
+            <w:r>
+              <w:rPr>
+                <w:noProof/>
+                <w:webHidden/>
+              </w:rPr>
+            </w:r>
+            <w:r>
+              <w:rPr>
+                <w:noProof/>
+                <w:webHidden/>
+              </w:rPr>
+              <w:fldChar w:fldCharType="separate"/>
+            </w:r>
+            <w:r>
+              <w:rPr>
+                <w:noProof/>
+                <w:webHidden/>
+              </w:rPr>
+              <w:t>4</w:t>
+            </w:r>
+            <w:r>
+              <w:rPr>
+                <w:noProof/>
+                <w:webHidden/>
+              </w:rPr>
+              <w:fldChar w:fldCharType="end"/>
+            </w:r>
+          </w:hyperlink>
+        </w:p>
+        <w:p>
+          <w:pPr>
+            <w:pStyle w:val="TOC2"/>
+            <w:tabs>
+              <w:tab w:val="right" w:leader="dot" w:pos="9016"/>
+            </w:tabs>
+            <w:rPr>
+              <w:rFonts w:eastAsiaTheme="minorEastAsia"/>
+              <w:noProof/>
+              <w:lang w:eastAsia="en-NZ"/>
+            </w:rPr>
+          </w:pPr>
+          <w:hyperlink w:anchor="_Toc234498520" w:history="1">
+            <w:r>
+              <w:rPr>
+                <w:rStyle w:val="Hyperlink"/>
+                <w:noProof/>
+              </w:rPr>
               <w:t>Email Address Verification</w:t>
             </w:r>
             <w:r>
@@ -634,7 +722,77 @@
                 <w:noProof/>
                 <w:webHidden/>
               </w:rPr>
-              <w:instrText xml:space="preserve"> PAGEREF _Toc234331600 \h </w:instrText>
+              <w:instrText xml:space="preserve"> PAGEREF _Toc234498520 \h </w:instrText>
+            </w:r>
+            <w:r>
+              <w:rPr>
+                <w:noProof/>
+                <w:webHidden/>
+              </w:rPr>
+            </w:r>
+            <w:r>
+              <w:rPr>
+                <w:noProof/>
+                <w:webHidden/>
+              </w:rPr>
+              <w:fldChar w:fldCharType="separate"/>
+            </w:r>
+            <w:r>
+              <w:rPr>
+                <w:noProof/>
+                <w:webHidden/>
+              </w:rPr>
+              <w:t>4</w:t>
+            </w:r>
+            <w:r>
+              <w:rPr>
+                <w:noProof/>
+                <w:webHidden/>
+              </w:rPr>
+              <w:fldChar w:fldCharType="end"/>
+            </w:r>
+          </w:hyperlink>
+        </w:p>
+        <w:p>
+          <w:pPr>
+            <w:pStyle w:val="TOC2"/>
+            <w:tabs>
+              <w:tab w:val="right" w:leader="dot" w:pos="9016"/>
+            </w:tabs>
+            <w:rPr>
+              <w:rFonts w:eastAsiaTheme="minorEastAsia"/>
+              <w:noProof/>
+              <w:lang w:eastAsia="en-NZ"/>
+            </w:rPr>
+          </w:pPr>
+          <w:hyperlink w:anchor="_Toc234498521" w:history="1">
+            <w:r>
+              <w:rPr>
+                <w:rStyle w:val="Hyperlink"/>
+                <w:noProof/>
+              </w:rPr>
+              <w:t>Masquerade Username</w:t>
+            </w:r>
+            <w:r>
+              <w:rPr>
+                <w:noProof/>
+                <w:webHidden/>
+              </w:rPr>
+              <w:tab/>
+            </w:r>
+            <w:r>
+              <w:rPr>
+                <w:noProof/>
+                <w:webHidden/>
+              </w:rPr>
+              <w:fldChar w:fldCharType="begin"/>
+            </w:r>
+            <w:r>
+              <w:rPr>
+                <w:noProof/>
+                <w:webHidden/>
+              </w:rPr>
+              <w:instrText xml:space="preserve"> PAGEREF _Toc234498521 \h </w:instrText>
             </w:r>
             <w:r>
               <w:rPr>
@@ -672,10 +830,12 @@
               <w:tab w:val="right" w:leader="dot" w:pos="9016"/>
             </w:tabs>
             <w:rPr>
+              <w:rFonts w:eastAsiaTheme="minorEastAsia"/>
               <w:noProof/>
+              <w:lang w:eastAsia="en-NZ"/>
             </w:rPr>
           </w:pPr>
-          <w:hyperlink w:anchor="_Toc234331601" w:history="1">
+          <w:hyperlink w:anchor="_Toc234498522" w:history="1">
             <w:r>
               <w:rPr>
                 <w:rStyle w:val="Hyperlink"/>
@@ -683,7 +843,7 @@
                 <w:kern w:val="0"/>
                 <w14:ligatures w14:val="none"/>
               </w:rPr>
-              <w:t>Authentication</w:t>
+              <w:t>Authentication (delete me)</w:t>
             </w:r>
             <w:r>
               <w:rPr>
@@ -704,7 +864,7 @@
                 <w:noProof/>
                 <w:webHidden/>
               </w:rPr>
-              <w:instrText xml:space="preserve"> PAGEREF _Toc234331601 \h </w:instrText>
+              <w:instrText xml:space="preserve"> PAGEREF _Toc234498522 \h </w:instrText>
             </w:r>
             <w:r>
               <w:rPr>
@@ -724,7 +884,7 @@
                 <w:noProof/>
                 <w:webHidden/>
               </w:rPr>
-              <w:t>4</w:t>
+              <w:t>5</w:t>
             </w:r>
             <w:r>
               <w:rPr>
@@ -758,7 +918,7 @@
         <w:pStyle w:val="Heading1"/>
         <w:spacing w:before="400" w:after="40" w:line="240" w:lineRule="auto"/>
       </w:pPr>
-      <w:bookmarkStart w:id="0" w:name="_Toc234331593"/>
+      <w:bookmarkStart w:id="0" w:name="_Toc234498512"/>
       <w:r>
         <w:rPr>
           <w:color w:val="0A2F41" w:themeColor="accent1" w:themeShade="80"/>
@@ -775,6 +935,7 @@
     </w:p>
     <w:p>
       <w:pPr>
+        <w:spacing w:after="0"/>
         <w:rPr>
           <w:i/>
           <w:iCs/>
@@ -785,20 +946,49 @@
           <w:i/>
           <w:iCs/>
         </w:rPr>
-        <w:t>A</w:t>
+        <w:t xml:space="preserve">Authentication: </w:t>
       </w:r>
       <w:r>
         <w:rPr>
           <w:i/>
           <w:iCs/>
         </w:rPr>
-        <w:t>uthenticating a user by entering credentials</w:t>
-      </w:r>
-      <w:r>
+        <w:t>Are you really who you say you are?</w:t>
+      </w:r>
+    </w:p>
+    <w:p>
+      <w:pPr>
         <w:rPr>
           <w:i/>
           <w:iCs/>
         </w:rPr>
+      </w:pPr>
+      <w:r>
+        <w:rPr>
+          <w:i/>
+          <w:iCs/>
+        </w:rPr>
+        <w:t xml:space="preserve">Login: </w:t>
+      </w:r>
+      <w:r>
+        <w:rPr>
+          <w:i/>
+          <w:iCs/>
+        </w:rPr>
+        <w:t>A</w:t>
+      </w:r>
+      <w:r>
+        <w:rPr>
+          <w:i/>
+          <w:iCs/>
+        </w:rPr>
+        <w:t>uthenticating a user by entering credentials</w:t>
+      </w:r>
+      <w:r>
+        <w:rPr>
+          <w:i/>
+          <w:iCs/>
+        </w:rPr>
         <w:t>.</w:t>
       </w:r>
     </w:p>
@@ -875,10 +1065,21 @@
         <w:t xml:space="preserve"> configured via the Organisation (Org) entity</w:t>
       </w:r>
       <w:r>
-        <w:t xml:space="preserve"> and the </w:t>
-      </w:r>
-      <w:r>
-        <w:t>LoginOption table</w:t>
+        <w:t xml:space="preserve"> and </w:t>
+      </w:r>
+      <w:r>
+        <w:t xml:space="preserve">replicated in </w:t>
+      </w:r>
+      <w:r>
+        <w:t xml:space="preserve">the </w:t>
+      </w:r>
+      <w:proofErr w:type="spellStart"/>
+      <w:r>
+        <w:t>LoginOption</w:t>
+      </w:r>
+      <w:proofErr w:type="spellEnd"/>
+      <w:r>
+        <w:t xml:space="preserve"> table</w:t>
       </w:r>
       <w:r>
         <w:t xml:space="preserve">. </w:t>
@@ -886,9 +1087,11 @@
       <w:r>
         <w:t xml:space="preserve">Note the </w:t>
       </w:r>
+      <w:proofErr w:type="spellStart"/>
       <w:r>
         <w:t>LoginOption</w:t>
       </w:r>
+      <w:proofErr w:type="spellEnd"/>
       <w:r>
         <w:t xml:space="preserve"> is manually configured – this may change in future with it being derived from the Org entity. </w:t>
       </w:r>
@@ -907,7 +1110,13 @@
         <w:t>login</w:t>
       </w:r>
       <w:r>
-        <w:t xml:space="preserve"> client. E.g., [host]/[code].</w:t>
+        <w:t xml:space="preserve"> client. </w:t>
+      </w:r>
+      <w:r>
+        <w:t>I.e.</w:t>
+      </w:r>
+      <w:r>
+        <w:t>, [host]/[code].</w:t>
       </w:r>
     </w:p>
     <w:p>
@@ -915,9 +1124,15 @@
         <w:t xml:space="preserve">The login options </w:t>
       </w:r>
       <w:r>
+        <w:t xml:space="preserve">for each URL suffix </w:t>
+      </w:r>
+      <w:r>
         <w:t xml:space="preserve">to be enabled </w:t>
       </w:r>
       <w:r>
+        <w:t xml:space="preserve">/ disabled </w:t>
+      </w:r>
+      <w:r>
         <w:t>are:</w:t>
       </w:r>
     </w:p>
@@ -930,7 +1145,7 @@
         </w:numPr>
       </w:pPr>
       <w:r>
-        <w:t>Org nr to log into, or org numbers to choose from.</w:t>
+        <w:t>Default org nr to log into.</w:t>
       </w:r>
     </w:p>
     <w:p>
@@ -942,7 +1157,7 @@
         </w:numPr>
       </w:pPr>
       <w:r>
-        <w:t>Language code choice, e.g. English, German, etc.</w:t>
+        <w:t>Default language code.</w:t>
       </w:r>
     </w:p>
     <w:p>
@@ -954,7 +1169,46 @@
         </w:numPr>
       </w:pPr>
       <w:r>
-        <w:t>Enable Multi Factor Authentication (</w:t>
+        <w:t>O</w:t>
+      </w:r>
+      <w:r>
+        <w:t>rg numbers to choose from.</w:t>
+      </w:r>
+    </w:p>
+    <w:p>
+      <w:pPr>
+        <w:pStyle w:val="ListParagraph"/>
+        <w:numPr>
+          <w:ilvl w:val="0"/>
+          <w:numId w:val="2"/>
+        </w:numPr>
+      </w:pPr>
+      <w:r>
+        <w:t xml:space="preserve">Language code </w:t>
+      </w:r>
+      <w:r>
+        <w:t xml:space="preserve">to </w:t>
+      </w:r>
+      <w:r>
+        <w:t>cho</w:t>
+      </w:r>
+      <w:r>
+        <w:t>os</w:t>
+      </w:r>
+      <w:r>
+        <w:t>e, e.g. English, German, etc.</w:t>
+      </w:r>
+    </w:p>
+    <w:p>
+      <w:pPr>
+        <w:pStyle w:val="ListParagraph"/>
+        <w:numPr>
+          <w:ilvl w:val="0"/>
+          <w:numId w:val="2"/>
+        </w:numPr>
+      </w:pPr>
+      <w:r>
+        <w:t>Multi Factor Authentication (</w:t>
       </w:r>
       <w:r>
         <w:t>MFA</w:t>
@@ -1002,12 +1256,24 @@
         <w:t>Email address verification.</w:t>
       </w:r>
     </w:p>
+    <w:p>
+      <w:pPr>
+        <w:pStyle w:val="ListParagraph"/>
+        <w:numPr>
+          <w:ilvl w:val="0"/>
+          <w:numId w:val="2"/>
+        </w:numPr>
+      </w:pPr>
+      <w:r>
+        <w:t>Masquerade User name</w:t>
+      </w:r>
+    </w:p>
     <w:p/>
     <w:p>
       <w:pPr>
         <w:pStyle w:val="Heading2"/>
       </w:pPr>
-      <w:bookmarkStart w:id="1" w:name="_Toc234331594"/>
+      <w:bookmarkStart w:id="1" w:name="_Toc234498513"/>
       <w:r>
         <w:t xml:space="preserve">Legacy </w:t>
       </w:r>
@@ -1098,6 +1364,7 @@
         </w:numPr>
       </w:pPr>
       <w:r>
+        <w:lastRenderedPageBreak/>
         <w:t>If they are a non-web client user, then the refresh token will be requested and displayed. No further action will occur.</w:t>
       </w:r>
     </w:p>
@@ -1106,21 +1373,266 @@
       <w:pPr>
         <w:pStyle w:val="Heading2"/>
       </w:pPr>
-      <w:bookmarkStart w:id="2" w:name="_Toc234331595"/>
+      <w:bookmarkStart w:id="2" w:name="_Toc234498514"/>
+      <w:r>
+        <w:t>Language Choice</w:t>
+      </w:r>
+      <w:bookmarkEnd w:id="2"/>
+    </w:p>
+    <w:p>
+      <w:r>
+        <w:t xml:space="preserve">The display language can be chosen via a drop-down. Once chosen it will be used to the main client. </w:t>
+      </w:r>
+    </w:p>
+    <w:p>
+      <w:r>
+        <w:t>If this option is not available, then the Org default language code will be used.</w:t>
+      </w:r>
+    </w:p>
+    <w:p/>
+    <w:p>
+      <w:pPr>
+        <w:pStyle w:val="Heading2"/>
+      </w:pPr>
+      <w:bookmarkStart w:id="3" w:name="_Toc234498515"/>
+      <w:r>
+        <w:t>Org Nr Choice</w:t>
+      </w:r>
+      <w:bookmarkEnd w:id="3"/>
+    </w:p>
+    <w:p>
+      <w:r>
+        <w:t>If available, the user can choose which org nr they wish to log into.</w:t>
+      </w:r>
+    </w:p>
+    <w:p>
+      <w:r>
+        <w:t xml:space="preserve">If this option is not available, then the Org Nr in the </w:t>
+      </w:r>
+      <w:proofErr w:type="spellStart"/>
+      <w:r>
+        <w:t>Loginoptions</w:t>
+      </w:r>
+      <w:proofErr w:type="spellEnd"/>
+      <w:r>
+        <w:t xml:space="preserve"> table will used.</w:t>
+      </w:r>
+    </w:p>
+    <w:p>
+      <w:r>
+        <w:t>Note: A user must first be given access rights to an Org Nr before being able to login into it.</w:t>
+      </w:r>
+    </w:p>
+    <w:p/>
+    <w:p>
+      <w:pPr>
+        <w:pStyle w:val="Heading2"/>
+      </w:pPr>
+      <w:bookmarkStart w:id="4" w:name="_Toc234498516"/>
+      <w:r>
+        <w:t>Lock Outs</w:t>
+      </w:r>
+      <w:bookmarkEnd w:id="4"/>
+    </w:p>
+    <w:p>
+      <w:r>
+        <w:t>If the user enters the wrong password, the system will:</w:t>
+      </w:r>
+    </w:p>
+    <w:p>
+      <w:pPr>
+        <w:pStyle w:val="ListParagraph"/>
+        <w:numPr>
+          <w:ilvl w:val="0"/>
+          <w:numId w:val="2"/>
+        </w:numPr>
+      </w:pPr>
+      <w:r>
+        <w:t xml:space="preserve">If &lt;= max attempts, message: </w:t>
+      </w:r>
+      <w:r>
+        <w:rPr>
+          <w:i/>
+          <w:iCs/>
+        </w:rPr>
+        <w:t>Incorrect username or password</w:t>
+      </w:r>
+    </w:p>
+    <w:p>
+      <w:pPr>
+        <w:pStyle w:val="ListParagraph"/>
+        <w:numPr>
+          <w:ilvl w:val="0"/>
+          <w:numId w:val="2"/>
+        </w:numPr>
+      </w:pPr>
+      <w:r>
+        <w:t xml:space="preserve">If lock out attempts not configured, message: </w:t>
+      </w:r>
+      <w:r>
+        <w:rPr>
+          <w:i/>
+          <w:iCs/>
+        </w:rPr>
+        <w:t>See your system admin to release your account (and reset you password if required)</w:t>
+      </w:r>
+    </w:p>
+    <w:p>
+      <w:pPr>
+        <w:pStyle w:val="ListParagraph"/>
+        <w:numPr>
+          <w:ilvl w:val="0"/>
+          <w:numId w:val="2"/>
+        </w:numPr>
+      </w:pPr>
+      <w:r>
+        <w:t xml:space="preserve">If &gt; max attempts and &lt;= lock out attempts, message: </w:t>
+      </w:r>
+      <w:r>
+        <w:rPr>
+          <w:i/>
+          <w:iCs/>
+        </w:rPr>
+        <w:t>Too many unsuccessful sign-in attempts. Your account has been temporarily locked for 15</w:t>
+      </w:r>
+      <w:r>
+        <w:rPr>
+          <w:i/>
+          <w:iCs/>
+        </w:rPr>
+        <w:t>?</w:t>
+      </w:r>
+      <w:r>
+        <w:rPr>
+          <w:i/>
+          <w:iCs/>
+        </w:rPr>
+        <w:t xml:space="preserve"> Minutes</w:t>
+      </w:r>
+    </w:p>
+    <w:p>
+      <w:pPr>
+        <w:pStyle w:val="ListParagraph"/>
+        <w:numPr>
+          <w:ilvl w:val="0"/>
+          <w:numId w:val="2"/>
+        </w:numPr>
+      </w:pPr>
+      <w:r>
+        <w:t xml:space="preserve">If &gt; lock out attempts, then: </w:t>
+      </w:r>
+      <w:r>
+        <w:rPr>
+          <w:i/>
+          <w:iCs/>
+        </w:rPr>
+        <w:t>Open</w:t>
+      </w:r>
+      <w:r>
+        <w:rPr>
+          <w:i/>
+          <w:iCs/>
+        </w:rPr>
+        <w:t xml:space="preserve"> password reset page</w:t>
+      </w:r>
+    </w:p>
+    <w:p/>
+    <w:p>
+      <w:pPr>
+        <w:pStyle w:val="Heading2"/>
+      </w:pPr>
+      <w:bookmarkStart w:id="5" w:name="_Toc234498517"/>
+      <w:r>
+        <w:t>MFA</w:t>
+      </w:r>
+      <w:bookmarkEnd w:id="5"/>
+    </w:p>
+    <w:p>
+      <w:r>
+        <w:t xml:space="preserve">If enforced, the user will be presented with a QR Code to configure their cell phone’s Authenticator app. </w:t>
+      </w:r>
+    </w:p>
+    <w:p>
+      <w:r>
+        <w:t xml:space="preserve">Once </w:t>
+      </w:r>
+      <w:r>
+        <w:t xml:space="preserve">MFA is </w:t>
+      </w:r>
+      <w:r>
+        <w:t xml:space="preserve">configured the user will be challenged </w:t>
+      </w:r>
+      <w:r>
+        <w:t xml:space="preserve">after a successful login </w:t>
+      </w:r>
+      <w:r>
+        <w:t>to provide the authenticator code.</w:t>
+      </w:r>
+      <w:r>
+        <w:t xml:space="preserve"> This step must also be successful before they are redirected to the main client (or have the refresh token displayed for non-web clients). </w:t>
+      </w:r>
+    </w:p>
+    <w:p/>
+    <w:p>
+      <w:pPr>
+        <w:pStyle w:val="Heading2"/>
+      </w:pPr>
+      <w:bookmarkStart w:id="6" w:name="_Toc234498518"/>
       <w:r>
         <w:lastRenderedPageBreak/>
-        <w:t>Language Choice</w:t>
-      </w:r>
-      <w:bookmarkEnd w:id="2"/>
-    </w:p>
-    <w:p>
-      <w:r>
-        <w:t xml:space="preserve">The display language can be chosen via a drop-down. Once chosen it will be used to the main client. </w:t>
-      </w:r>
-    </w:p>
-    <w:p>
-      <w:r>
-        <w:t>If this option is not available, then the Org default language code will be used.</w:t>
+        <w:t>Forgot Username / Password</w:t>
+      </w:r>
+      <w:bookmarkEnd w:id="6"/>
+    </w:p>
+    <w:p>
+      <w:r>
+        <w:t>If users forget their credentials, they can request a reset.</w:t>
+      </w:r>
+    </w:p>
+    <w:p>
+      <w:r>
+        <w:t>Users will provide their email address and click the link. If the email address is found</w:t>
+      </w:r>
+      <w:r>
+        <w:t xml:space="preserve"> for an active user</w:t>
+      </w:r>
+      <w:r>
+        <w:t>, an email is sent with:</w:t>
+      </w:r>
+    </w:p>
+    <w:p>
+      <w:pPr>
+        <w:pStyle w:val="ListParagraph"/>
+        <w:numPr>
+          <w:ilvl w:val="0"/>
+          <w:numId w:val="2"/>
+        </w:numPr>
+      </w:pPr>
+      <w:r>
+        <w:t>Their username.</w:t>
+      </w:r>
+    </w:p>
+    <w:p>
+      <w:pPr>
+        <w:pStyle w:val="ListParagraph"/>
+        <w:numPr>
+          <w:ilvl w:val="0"/>
+          <w:numId w:val="2"/>
+        </w:numPr>
+      </w:pPr>
+      <w:r>
+        <w:t>A link to reset their password.</w:t>
+      </w:r>
+      <w:r>
+        <w:t xml:space="preserve"> Note there is an expiry time on the link.</w:t>
+      </w:r>
+    </w:p>
+    <w:p>
+      <w:r>
+        <w:t xml:space="preserve">Clicking the </w:t>
+      </w:r>
+      <w:r>
+        <w:t>reset link will take them to a web page to allow them to enter a new password.</w:t>
       </w:r>
     </w:p>
     <w:p/>
@@ -1128,31 +1640,90 @@
       <w:pPr>
         <w:pStyle w:val="Heading2"/>
       </w:pPr>
-      <w:bookmarkStart w:id="3" w:name="_Toc234331596"/>
-      <w:r>
-        <w:t>Org Nr</w:t>
-      </w:r>
-      <w:r>
-        <w:t xml:space="preserve"> Choice</w:t>
-      </w:r>
-      <w:bookmarkEnd w:id="3"/>
-    </w:p>
-    <w:p>
-      <w:r>
-        <w:t>If available, the user can choose which org nr they wish to log into.</w:t>
-      </w:r>
-    </w:p>
-    <w:p>
-      <w:r>
-        <w:t xml:space="preserve">If this option is not available, then the Org </w:t>
-      </w:r>
-      <w:r>
-        <w:t>Nr in the Loginoptions table will used.</w:t>
-      </w:r>
-    </w:p>
-    <w:p>
-      <w:r>
-        <w:t>Note: A user must first be given access rights to an Org Nr before being able to login into it.</w:t>
+      <w:bookmarkStart w:id="7" w:name="_Toc234498519"/>
+      <w:r>
+        <w:t>Self-Registration (Signup)</w:t>
+      </w:r>
+      <w:bookmarkEnd w:id="7"/>
+    </w:p>
+    <w:p>
+      <w:r>
+        <w:t>New users can request access to the system:</w:t>
+      </w:r>
+    </w:p>
+    <w:p>
+      <w:pPr>
+        <w:pStyle w:val="ListParagraph"/>
+        <w:numPr>
+          <w:ilvl w:val="0"/>
+          <w:numId w:val="2"/>
+        </w:numPr>
+      </w:pPr>
+      <w:r>
+        <w:t>They open the login page and click the ‘Signup’ link.</w:t>
+      </w:r>
+    </w:p>
+    <w:p>
+      <w:pPr>
+        <w:pStyle w:val="ListParagraph"/>
+        <w:numPr>
+          <w:ilvl w:val="0"/>
+          <w:numId w:val="2"/>
+        </w:numPr>
+      </w:pPr>
+      <w:r>
+        <w:t xml:space="preserve">A form requesting their chosen username, email and password is presented. </w:t>
+      </w:r>
+    </w:p>
+    <w:p>
+      <w:pPr>
+        <w:pStyle w:val="ListParagraph"/>
+        <w:numPr>
+          <w:ilvl w:val="0"/>
+          <w:numId w:val="2"/>
+        </w:numPr>
+      </w:pPr>
+      <w:r>
+        <w:t>Once the form is validated, an</w:t>
+      </w:r>
+      <w:r>
+        <w:t xml:space="preserve"> email is sent with a link to verify their email.</w:t>
+      </w:r>
+    </w:p>
+    <w:p>
+      <w:pPr>
+        <w:pStyle w:val="ListParagraph"/>
+        <w:numPr>
+          <w:ilvl w:val="0"/>
+          <w:numId w:val="2"/>
+        </w:numPr>
+      </w:pPr>
+      <w:r>
+        <w:t>The email validation lasts 24 hours, after which time they must request a new validation email.</w:t>
+      </w:r>
+    </w:p>
+    <w:p>
+      <w:pPr>
+        <w:pStyle w:val="ListParagraph"/>
+        <w:numPr>
+          <w:ilvl w:val="0"/>
+          <w:numId w:val="2"/>
+        </w:numPr>
+      </w:pPr>
+      <w:r>
+        <w:t>Unverified accounts are deleted after 30 days.</w:t>
+      </w:r>
+    </w:p>
+    <w:p>
+      <w:pPr>
+        <w:pStyle w:val="ListParagraph"/>
+        <w:numPr>
+          <w:ilvl w:val="0"/>
+          <w:numId w:val="2"/>
+        </w:numPr>
+      </w:pPr>
+      <w:r>
+        <w:t>Once the email is verified, they can login.</w:t>
       </w:r>
     </w:p>
     <w:p/>
@@ -1160,47 +1731,63 @@
       <w:pPr>
         <w:pStyle w:val="Heading2"/>
       </w:pPr>
-      <w:bookmarkStart w:id="4" w:name="_Toc234331597"/>
-      <w:r>
-        <w:t>MFA</w:t>
-      </w:r>
-      <w:bookmarkEnd w:id="4"/>
-    </w:p>
-    <w:p>
-      <w:r>
-        <w:t xml:space="preserve">If enforced, the user will be presented with a QR Code to configure their cell phone’s </w:t>
-      </w:r>
-      <w:r>
-        <w:t>Authenticator app</w:t>
-      </w:r>
-      <w:r>
-        <w:t xml:space="preserve">. </w:t>
-      </w:r>
-    </w:p>
-    <w:p>
-      <w:r>
-        <w:t xml:space="preserve">Once </w:t>
-      </w:r>
-      <w:r>
-        <w:t xml:space="preserve">MFA is </w:t>
-      </w:r>
-      <w:r>
-        <w:t xml:space="preserve">configured the user will be challenged </w:t>
-      </w:r>
-      <w:r>
-        <w:t xml:space="preserve">after a successful login </w:t>
-      </w:r>
-      <w:r>
-        <w:t>to provide the a</w:t>
-      </w:r>
-      <w:r>
-        <w:t>uthenticator</w:t>
-      </w:r>
-      <w:r>
-        <w:t xml:space="preserve"> code.</w:t>
-      </w:r>
-      <w:r>
-        <w:t xml:space="preserve"> This step must also be successful before they are redirected to the main client (or have the refresh token displayed for non-web clients). </w:t>
+      <w:bookmarkStart w:id="8" w:name="_Toc234498520"/>
+      <w:r>
+        <w:t>Email Address Verification</w:t>
+      </w:r>
+      <w:bookmarkEnd w:id="8"/>
+    </w:p>
+    <w:p>
+      <w:r>
+        <w:t>Users can request their email address to be verified:</w:t>
+      </w:r>
+    </w:p>
+    <w:p>
+      <w:pPr>
+        <w:pStyle w:val="ListParagraph"/>
+        <w:numPr>
+          <w:ilvl w:val="0"/>
+          <w:numId w:val="2"/>
+        </w:numPr>
+      </w:pPr>
+      <w:r>
+        <w:t>They open the login page and click the ‘Verify Email Address’ link.</w:t>
+      </w:r>
+    </w:p>
+    <w:p>
+      <w:pPr>
+        <w:pStyle w:val="ListParagraph"/>
+        <w:numPr>
+          <w:ilvl w:val="0"/>
+          <w:numId w:val="2"/>
+        </w:numPr>
+      </w:pPr>
+      <w:r>
+        <w:t xml:space="preserve">A form requesting their email is presented. </w:t>
+      </w:r>
+    </w:p>
+    <w:p>
+      <w:pPr>
+        <w:pStyle w:val="ListParagraph"/>
+        <w:numPr>
+          <w:ilvl w:val="0"/>
+          <w:numId w:val="2"/>
+        </w:numPr>
+      </w:pPr>
+      <w:r>
+        <w:t>Once the form is validated, the email address will be recorded as verified.</w:t>
+      </w:r>
+    </w:p>
+    <w:p>
+      <w:pPr>
+        <w:pStyle w:val="ListParagraph"/>
+        <w:numPr>
+          <w:ilvl w:val="0"/>
+          <w:numId w:val="2"/>
+        </w:numPr>
+      </w:pPr>
+      <w:r>
+        <w:t>If the Org enforces email verification, they can login.</w:t>
       </w:r>
     </w:p>
     <w:p/>
@@ -1208,235 +1795,28 @@
       <w:pPr>
         <w:pStyle w:val="Heading2"/>
       </w:pPr>
-      <w:bookmarkStart w:id="5" w:name="_Toc234331598"/>
-      <w:r>
-        <w:t>Forgot Username / Password</w:t>
-      </w:r>
-      <w:bookmarkEnd w:id="5"/>
-    </w:p>
-    <w:p>
-      <w:r>
-        <w:t>If users forget their credentials, they can request a reset.</w:t>
-      </w:r>
-    </w:p>
-    <w:p>
-      <w:r>
-        <w:t>Users will provide their email address and click the link. If the email address is found</w:t>
-      </w:r>
-      <w:r>
-        <w:t xml:space="preserve"> for an active user</w:t>
-      </w:r>
-      <w:r>
-        <w:t>, an email is sent with:</w:t>
-      </w:r>
-    </w:p>
-    <w:p>
-      <w:pPr>
-        <w:pStyle w:val="ListParagraph"/>
-        <w:numPr>
-          <w:ilvl w:val="0"/>
-          <w:numId w:val="2"/>
-        </w:numPr>
-      </w:pPr>
-      <w:r>
-        <w:t>Their username.</w:t>
-      </w:r>
-    </w:p>
-    <w:p>
-      <w:pPr>
-        <w:pStyle w:val="ListParagraph"/>
-        <w:numPr>
-          <w:ilvl w:val="0"/>
-          <w:numId w:val="2"/>
-        </w:numPr>
-      </w:pPr>
-      <w:r>
-        <w:t>A link to reset their password.</w:t>
-      </w:r>
-      <w:r>
-        <w:t xml:space="preserve"> Note there is an expiry time on the link.</w:t>
-      </w:r>
-    </w:p>
-    <w:p>
-      <w:r>
-        <w:t xml:space="preserve">Clicking the </w:t>
-      </w:r>
-      <w:r>
-        <w:t>reset link will take them to a web page to allow them to enter a new password.</w:t>
+      <w:bookmarkStart w:id="9" w:name="_Toc234498521"/>
+      <w:r>
+        <w:t>Masquerade Username</w:t>
+      </w:r>
+      <w:bookmarkEnd w:id="9"/>
+      <w:r>
+        <w:t xml:space="preserve"> </w:t>
+      </w:r>
+    </w:p>
+    <w:p>
+      <w:r>
+        <w:t>System admins can login masquerading as another user (although not service user). The must enter their own credentials along with the username to masquerade as. All updates will be logged as the masqueraded user plus the system admin username.</w:t>
       </w:r>
     </w:p>
     <w:p/>
-    <w:p>
-      <w:pPr>
-        <w:pStyle w:val="Heading2"/>
-      </w:pPr>
-      <w:bookmarkStart w:id="6" w:name="_Toc234331599"/>
-      <w:r>
-        <w:t>Self-Registration (Signup)</w:t>
-      </w:r>
-      <w:bookmarkEnd w:id="6"/>
-    </w:p>
-    <w:p>
-      <w:r>
-        <w:t>New</w:t>
-      </w:r>
-      <w:r>
-        <w:t xml:space="preserve"> users</w:t>
-      </w:r>
-      <w:r>
-        <w:t xml:space="preserve"> can request access to the system:</w:t>
-      </w:r>
-    </w:p>
-    <w:p>
-      <w:pPr>
-        <w:pStyle w:val="ListParagraph"/>
-        <w:numPr>
-          <w:ilvl w:val="0"/>
-          <w:numId w:val="2"/>
-        </w:numPr>
-      </w:pPr>
-      <w:r>
-        <w:t>They open the login page and click the ‘Signup’ link.</w:t>
-      </w:r>
-    </w:p>
-    <w:p>
-      <w:pPr>
-        <w:pStyle w:val="ListParagraph"/>
-        <w:numPr>
-          <w:ilvl w:val="0"/>
-          <w:numId w:val="2"/>
-        </w:numPr>
-      </w:pPr>
-      <w:r>
-        <w:lastRenderedPageBreak/>
-        <w:t xml:space="preserve">A form requesting their chosen username, email and password is presented. </w:t>
-      </w:r>
-    </w:p>
-    <w:p>
-      <w:pPr>
-        <w:pStyle w:val="ListParagraph"/>
-        <w:numPr>
-          <w:ilvl w:val="0"/>
-          <w:numId w:val="2"/>
-        </w:numPr>
-      </w:pPr>
-      <w:r>
-        <w:t>Once the form is validated, an</w:t>
-      </w:r>
-      <w:r>
-        <w:t xml:space="preserve"> email is sent with a link to verify their email.</w:t>
-      </w:r>
-    </w:p>
-    <w:p>
-      <w:pPr>
-        <w:pStyle w:val="ListParagraph"/>
-        <w:numPr>
-          <w:ilvl w:val="0"/>
-          <w:numId w:val="2"/>
-        </w:numPr>
-      </w:pPr>
-      <w:r>
-        <w:t>Once the email is verified, they can login.</w:t>
-      </w:r>
-    </w:p>
-    <w:p/>
-    <w:p>
-      <w:pPr>
-        <w:pStyle w:val="Heading2"/>
-      </w:pPr>
-      <w:bookmarkStart w:id="7" w:name="_Toc234331600"/>
-      <w:r>
-        <w:t>Email Address Verification</w:t>
-      </w:r>
-      <w:bookmarkEnd w:id="7"/>
-    </w:p>
-    <w:p>
-      <w:r>
-        <w:t>U</w:t>
-      </w:r>
-      <w:r>
-        <w:t xml:space="preserve">sers can request </w:t>
-      </w:r>
-      <w:r>
-        <w:t>their email address to be verified</w:t>
-      </w:r>
-      <w:r>
-        <w:t>:</w:t>
-      </w:r>
-    </w:p>
-    <w:p>
-      <w:pPr>
-        <w:pStyle w:val="ListParagraph"/>
-        <w:numPr>
-          <w:ilvl w:val="0"/>
-          <w:numId w:val="2"/>
-        </w:numPr>
-      </w:pPr>
-      <w:r>
-        <w:t>They open the login page and click the ‘</w:t>
-      </w:r>
-      <w:r>
-        <w:t>Verify Email Address</w:t>
-      </w:r>
-      <w:r>
-        <w:t>’ link.</w:t>
-      </w:r>
-    </w:p>
-    <w:p>
-      <w:pPr>
-        <w:pStyle w:val="ListParagraph"/>
-        <w:numPr>
-          <w:ilvl w:val="0"/>
-          <w:numId w:val="2"/>
-        </w:numPr>
-      </w:pPr>
-      <w:r>
-        <w:t xml:space="preserve">A form requesting their email is presented. </w:t>
-      </w:r>
-    </w:p>
-    <w:p>
-      <w:pPr>
-        <w:pStyle w:val="ListParagraph"/>
-        <w:numPr>
-          <w:ilvl w:val="0"/>
-          <w:numId w:val="2"/>
-        </w:numPr>
-      </w:pPr>
-      <w:r>
-        <w:t xml:space="preserve">Once the form is validated, </w:t>
-      </w:r>
-      <w:r>
-        <w:t>the</w:t>
-      </w:r>
-      <w:r>
-        <w:t xml:space="preserve"> email </w:t>
-      </w:r>
-      <w:r>
-        <w:t>address will be recorded as verified.</w:t>
-      </w:r>
-    </w:p>
-    <w:p>
-      <w:pPr>
-        <w:pStyle w:val="ListParagraph"/>
-        <w:numPr>
-          <w:ilvl w:val="0"/>
-          <w:numId w:val="2"/>
-        </w:numPr>
-      </w:pPr>
-      <w:r>
-        <w:t xml:space="preserve">If the Org enforces email verification, </w:t>
-      </w:r>
-      <w:r>
-        <w:t>they can login.</w:t>
-      </w:r>
-    </w:p>
     <w:p/>
     <w:p>
       <w:pPr>
         <w:pStyle w:val="Heading1"/>
         <w:spacing w:before="400" w:after="40" w:line="240" w:lineRule="auto"/>
       </w:pPr>
-      <w:bookmarkStart w:id="8" w:name="_Toc234331601"/>
+      <w:bookmarkStart w:id="10" w:name="_Toc234498522"/>
       <w:r>
         <w:rPr>
           <w:color w:val="0A2F41" w:themeColor="accent1" w:themeShade="80"/>
@@ -1446,9 +1826,9 @@
           <w:u w:val="single"/>
           <w14:ligatures w14:val="none"/>
         </w:rPr>
+        <w:lastRenderedPageBreak/>
         <w:t>Authentication</w:t>
       </w:r>
-      <w:bookmarkEnd w:id="8"/>
       <w:r>
         <w:rPr>
           <w:color w:val="0A2F41" w:themeColor="accent1" w:themeShade="80"/>
@@ -1460,6 +1840,7 @@
         </w:rPr>
         <w:t xml:space="preserve"> (delete me)</w:t>
       </w:r>
+      <w:bookmarkEnd w:id="10"/>
     </w:p>
     <w:p>
       <w:pPr>
@@ -1591,12 +1972,14 @@
       <w:r>
         <w:t>The Backend API returns a token key for successful logins. The user is then forwarded (</w:t>
       </w:r>
+      <w:proofErr w:type="spellStart"/>
       <w:r>
         <w:rPr>
           <w:rFonts w:ascii="Courier New" w:hAnsi="Courier New" w:cs="Courier New"/>
         </w:rPr>
         <w:t>NavigateTo</w:t>
       </w:r>
+      <w:proofErr w:type="spellEnd"/>
       <w:r>
         <w:t>) to FrontendServer project. This is the actual web client. The forwarding URL is given a fragment that contains the token key.</w:t>
       </w:r>
@@ -1688,7 +2071,6 @@
         </w:numPr>
       </w:pPr>
       <w:r>
-        <w:lastRenderedPageBreak/>
         <w:t>Mostly like a direct API call to the Backend API login process.</w:t>
       </w:r>
     </w:p>

</xml_diff>

<commit_message>
Warning and max attempts done. Close #49
</commit_message>
<xml_diff>
--- a/docs/Login.docx
+++ b/docs/Login.docx
@@ -1265,8 +1265,13 @@
         </w:numPr>
       </w:pPr>
       <w:r>
-        <w:t>Masquerade User name</w:t>
-      </w:r>
+        <w:t xml:space="preserve">Masquerade </w:t>
+      </w:r>
+      <w:proofErr w:type="gramStart"/>
+      <w:r>
+        <w:t>User name</w:t>
+      </w:r>
+      <w:proofErr w:type="gramEnd"/>
     </w:p>
     <w:p/>
     <w:p>
@@ -1448,7 +1453,26 @@
         </w:numPr>
       </w:pPr>
       <w:r>
-        <w:t xml:space="preserve">If &lt;= max attempts, message: </w:t>
+        <w:t xml:space="preserve">If </w:t>
+      </w:r>
+      <w:r>
+        <w:t>attempts</w:t>
+      </w:r>
+      <w:r>
+        <w:t xml:space="preserve"> </w:t>
+      </w:r>
+      <w:r>
+        <w:t>&lt;= max attempts</w:t>
+      </w:r>
+      <w:r>
+        <w:t>:</w:t>
+      </w:r>
+      <w:r>
+        <w:br/>
+        <w:t>M</w:t>
+      </w:r>
+      <w:r>
+        <w:t xml:space="preserve">essage: </w:t>
       </w:r>
       <w:r>
         <w:rPr>
@@ -1456,6 +1480,29 @@
           <w:iCs/>
         </w:rPr>
         <w:t>Incorrect username or password</w:t>
+      </w:r>
+      <w:r>
+        <w:rPr>
+          <w:i/>
+          <w:iCs/>
+        </w:rPr>
+        <w:br/>
+      </w:r>
+      <w:r>
+        <w:t>M</w:t>
+      </w:r>
+      <w:r>
+        <w:t>ax attempts</w:t>
+      </w:r>
+      <w:r>
+        <w:t xml:space="preserve"> default = 5, org configurable</w:t>
+      </w:r>
+      <w:r>
+        <w:rPr>
+          <w:i/>
+          <w:iCs/>
+        </w:rPr>
+        <w:br/>
       </w:r>
     </w:p>
     <w:p>
@@ -1467,14 +1514,87 @@
         </w:numPr>
       </w:pPr>
       <w:r>
-        <w:t xml:space="preserve">If lock out attempts not configured, message: </w:t>
+        <w:t xml:space="preserve">If </w:t>
+      </w:r>
+      <w:r>
+        <w:t>attempts</w:t>
+      </w:r>
+      <w:r>
+        <w:t xml:space="preserve"> </w:t>
+      </w:r>
+      <w:r>
+        <w:t xml:space="preserve">&gt; max attempts and </w:t>
+      </w:r>
+      <w:r>
+        <w:t>attempts</w:t>
+      </w:r>
+      <w:r>
+        <w:t xml:space="preserve"> </w:t>
+      </w:r>
+      <w:r>
+        <w:t>&lt;= lock out attempts</w:t>
+      </w:r>
+      <w:r>
+        <w:t>:</w:t>
+      </w:r>
+      <w:r>
+        <w:br/>
+        <w:t>M</w:t>
+      </w:r>
+      <w:r>
+        <w:t xml:space="preserve">essage: </w:t>
       </w:r>
       <w:r>
         <w:rPr>
           <w:i/>
           <w:iCs/>
         </w:rPr>
-        <w:t>See your system admin to release your account (and reset you password if required)</w:t>
+        <w:t>Too many unsuccessful sign-in attempts. Your account has been temporarily locked for 15 Minutes</w:t>
+      </w:r>
+      <w:r>
+        <w:rPr>
+          <w:i/>
+          <w:iCs/>
+        </w:rPr>
+        <w:t xml:space="preserve"> </w:t>
+      </w:r>
+      <w:r>
+        <w:t>(</w:t>
+      </w:r>
+      <w:r>
+        <w:t>org configurable</w:t>
+      </w:r>
+      <w:r>
+        <w:t>)</w:t>
+      </w:r>
+      <w:r>
+        <w:rPr>
+          <w:i/>
+          <w:iCs/>
+        </w:rPr>
+        <w:br/>
+        <w:t>Include a l</w:t>
+      </w:r>
+      <w:r>
+        <w:rPr>
+          <w:i/>
+          <w:iCs/>
+        </w:rPr>
+        <w:t xml:space="preserve">ink for </w:t>
+      </w:r>
+      <w:r>
+        <w:rPr>
+          <w:i/>
+          <w:iCs/>
+        </w:rPr>
+        <w:t>Password Reset</w:t>
+      </w:r>
+      <w:r>
+        <w:rPr>
+          <w:i/>
+          <w:iCs/>
+        </w:rPr>
+        <w:br/>
       </w:r>
     </w:p>
     <w:p>
@@ -1486,54 +1606,65 @@
         </w:numPr>
       </w:pPr>
       <w:r>
-        <w:t xml:space="preserve">If &gt; max attempts and &lt;= lock out attempts, message: </w:t>
+        <w:t xml:space="preserve">If </w:t>
+      </w:r>
+      <w:r>
+        <w:t xml:space="preserve">attempts </w:t>
+      </w:r>
+      <w:r>
+        <w:t>&gt;</w:t>
+      </w:r>
+      <w:r>
+        <w:t xml:space="preserve"> </w:t>
+      </w:r>
+      <w:r>
+        <w:t>lock out attempts</w:t>
+      </w:r>
+      <w:r>
+        <w:br/>
+        <w:t>Notify user via email</w:t>
+      </w:r>
+      <w:r>
+        <w:br/>
+        <w:t>Option - M</w:t>
+      </w:r>
+      <w:r>
+        <w:t xml:space="preserve">essage: </w:t>
       </w:r>
       <w:r>
         <w:rPr>
           <w:i/>
           <w:iCs/>
         </w:rPr>
-        <w:t>Too many unsuccessful sign-in attempts. Your account has been temporarily locked for 15</w:t>
+        <w:t>See your system admin to release your account (and reset you</w:t>
       </w:r>
       <w:r>
         <w:rPr>
           <w:i/>
           <w:iCs/>
         </w:rPr>
-        <w:t>?</w:t>
+        <w:t>r</w:t>
       </w:r>
       <w:r>
         <w:rPr>
           <w:i/>
           <w:iCs/>
         </w:rPr>
-        <w:t xml:space="preserve"> Minutes</w:t>
-      </w:r>
-    </w:p>
-    <w:p>
-      <w:pPr>
-        <w:pStyle w:val="ListParagraph"/>
-        <w:numPr>
-          <w:ilvl w:val="0"/>
-          <w:numId w:val="2"/>
-        </w:numPr>
-      </w:pPr>
-      <w:r>
-        <w:t xml:space="preserve">If &gt; lock out attempts, then: </w:t>
+        <w:t xml:space="preserve"> password if required)</w:t>
       </w:r>
       <w:r>
         <w:rPr>
           <w:i/>
           <w:iCs/>
         </w:rPr>
-        <w:t>Open</w:t>
+        <w:br/>
       </w:r>
       <w:r>
         <w:rPr>
           <w:i/>
           <w:iCs/>
         </w:rPr>
-        <w:t xml:space="preserve"> password reset page</w:t>
+        <w:t>Disable password reset</w:t>
       </w:r>
     </w:p>
     <w:p/>
@@ -1543,6 +1674,7 @@
       </w:pPr>
       <w:bookmarkStart w:id="5" w:name="_Toc234498517"/>
       <w:r>
+        <w:lastRenderedPageBreak/>
         <w:t>MFA</w:t>
       </w:r>
       <w:bookmarkEnd w:id="5"/>
@@ -1572,14 +1704,25 @@
         <w:t xml:space="preserve"> This step must also be successful before they are redirected to the main client (or have the refresh token displayed for non-web clients). </w:t>
       </w:r>
     </w:p>
-    <w:p/>
+    <w:p>
+      <w:pPr>
+        <w:rPr>
+          <w:color w:val="EE0000"/>
+        </w:rPr>
+      </w:pPr>
+      <w:r>
+        <w:rPr>
+          <w:color w:val="EE0000"/>
+        </w:rPr>
+        <w:t>‘I am not a robot’ checkbox</w:t>
+      </w:r>
+    </w:p>
     <w:p>
       <w:pPr>
         <w:pStyle w:val="Heading2"/>
       </w:pPr>
       <w:bookmarkStart w:id="6" w:name="_Toc234498518"/>
       <w:r>
-        <w:lastRenderedPageBreak/>
         <w:t>Forgot Username / Password</w:t>
       </w:r>
       <w:bookmarkEnd w:id="6"/>
@@ -1826,7 +1969,6 @@
           <w:u w:val="single"/>
           <w14:ligatures w14:val="none"/>
         </w:rPr>
-        <w:lastRenderedPageBreak/>
         <w:t>Authentication</w:t>
       </w:r>
       <w:r>
@@ -1885,12 +2027,14 @@
       <w:r>
         <w:t xml:space="preserve">into the application. If configured, the user can choose the organisation and language they want to login to (otherwise the default is used as specified in the </w:t>
       </w:r>
+      <w:proofErr w:type="gramStart"/>
       <w:r>
         <w:rPr>
           <w:rFonts w:ascii="Courier New" w:hAnsi="Courier New" w:cs="Courier New"/>
         </w:rPr>
         <w:t>cntrl.loginoption</w:t>
       </w:r>
+      <w:proofErr w:type="gramEnd"/>
       <w:r>
         <w:t xml:space="preserve"> table).</w:t>
       </w:r>
@@ -2028,12 +2172,14 @@
       <w:r>
         <w:t xml:space="preserve">If configured (i.e. the </w:t>
       </w:r>
+      <w:proofErr w:type="gramStart"/>
       <w:r>
         <w:rPr>
           <w:rFonts w:ascii="Courier New" w:hAnsi="Courier New" w:cs="Courier New"/>
         </w:rPr>
         <w:t>cntrl.loginoption</w:t>
       </w:r>
+      <w:proofErr w:type="gramEnd"/>
       <w:r>
         <w:t xml:space="preserve"> is flagged as external) then the user is returned the token. They can then use this in their API calls.</w:t>
       </w:r>
@@ -2077,6 +2223,7 @@
     <w:p/>
     <w:p>
       <w:r>
+        <w:lastRenderedPageBreak/>
         <w:br/>
       </w:r>
     </w:p>
@@ -3110,7 +3257,6 @@
   <w:style w:type="character" w:default="1" w:styleId="DefaultParagraphFont">
     <w:name w:val="Default Paragraph Font"/>
     <w:uiPriority w:val="1"/>
-    <w:semiHidden/>
     <w:unhideWhenUsed/>
   </w:style>
   <w:style w:type="table" w:default="1" w:styleId="TableNormal">

</xml_diff>

<commit_message>
Rate limit done, added api login
</commit_message>
<xml_diff>
--- a/docs/Login.docx
+++ b/docs/Login.docx
@@ -1071,29 +1071,13 @@
         <w:t xml:space="preserve">replicated in </w:t>
       </w:r>
       <w:r>
-        <w:t xml:space="preserve">the </w:t>
-      </w:r>
-      <w:proofErr w:type="spellStart"/>
-      <w:r>
-        <w:t>LoginOption</w:t>
-      </w:r>
-      <w:proofErr w:type="spellEnd"/>
-      <w:r>
-        <w:t xml:space="preserve"> table</w:t>
+        <w:t>the LoginOption table</w:t>
       </w:r>
       <w:r>
         <w:t xml:space="preserve">. </w:t>
       </w:r>
       <w:r>
-        <w:t xml:space="preserve">Note the </w:t>
-      </w:r>
-      <w:proofErr w:type="spellStart"/>
-      <w:r>
-        <w:t>LoginOption</w:t>
-      </w:r>
-      <w:proofErr w:type="spellEnd"/>
-      <w:r>
-        <w:t xml:space="preserve"> is manually configured – this may change in future with it being derived from the Org entity. </w:t>
+        <w:t xml:space="preserve">Note the LoginOption is manually configured – this may change in future with it being derived from the Org entity. </w:t>
       </w:r>
     </w:p>
     <w:p>
@@ -1265,13 +1249,8 @@
         </w:numPr>
       </w:pPr>
       <w:r>
-        <w:t xml:space="preserve">Masquerade </w:t>
-      </w:r>
-      <w:proofErr w:type="gramStart"/>
-      <w:r>
-        <w:t>User name</w:t>
-      </w:r>
-      <w:proofErr w:type="gramEnd"/>
+        <w:t>Masquerade User name</w:t>
+      </w:r>
     </w:p>
     <w:p/>
     <w:p>
@@ -1412,15 +1391,7 @@
     </w:p>
     <w:p>
       <w:r>
-        <w:t xml:space="preserve">If this option is not available, then the Org Nr in the </w:t>
-      </w:r>
-      <w:proofErr w:type="spellStart"/>
-      <w:r>
-        <w:t>Loginoptions</w:t>
-      </w:r>
-      <w:proofErr w:type="spellEnd"/>
-      <w:r>
-        <w:t xml:space="preserve"> table will used.</w:t>
+        <w:t>If this option is not available, then the Org Nr in the Loginoptions table will used.</w:t>
       </w:r>
     </w:p>
     <w:p>
@@ -1912,13 +1883,11 @@
       </w:r>
     </w:p>
     <w:p/>
-    <w:p/>
     <w:p>
       <w:pPr>
         <w:pStyle w:val="Heading1"/>
         <w:spacing w:before="400" w:after="40" w:line="240" w:lineRule="auto"/>
       </w:pPr>
-      <w:bookmarkStart w:id="10" w:name="_Toc234498522"/>
       <w:r>
         <w:rPr>
           <w:color w:val="0A2F41" w:themeColor="accent1" w:themeShade="80"/>
@@ -1928,8 +1897,39 @@
           <w:u w:val="single"/>
           <w14:ligatures w14:val="none"/>
         </w:rPr>
-        <w:t>Authentication</w:t>
-      </w:r>
+        <w:t>Tokens</w:t>
+      </w:r>
+    </w:p>
+    <w:p>
+      <w:pPr>
+        <w:rPr>
+          <w:i/>
+          <w:iCs/>
+        </w:rPr>
+      </w:pPr>
+      <w:r>
+        <w:rPr>
+          <w:i/>
+          <w:iCs/>
+        </w:rPr>
+        <w:t>Are you really who you say you are?</w:t>
+      </w:r>
+    </w:p>
+    <w:p>
+      <w:r>
+        <w:t>The trail….</w:t>
+      </w:r>
+    </w:p>
+    <w:p/>
+    <w:p/>
+    <w:p/>
+    <w:p/>
+    <w:p>
+      <w:pPr>
+        <w:pStyle w:val="Heading1"/>
+        <w:spacing w:before="400" w:after="40" w:line="240" w:lineRule="auto"/>
+      </w:pPr>
+      <w:bookmarkStart w:id="10" w:name="_Toc234498522"/>
       <w:r>
         <w:rPr>
           <w:color w:val="0A2F41" w:themeColor="accent1" w:themeShade="80"/>
@@ -1939,6 +1939,17 @@
           <w:u w:val="single"/>
           <w14:ligatures w14:val="none"/>
         </w:rPr>
+        <w:t>Authentication</w:t>
+      </w:r>
+      <w:r>
+        <w:rPr>
+          <w:color w:val="0A2F41" w:themeColor="accent1" w:themeShade="80"/>
+          <w:kern w:val="0"/>
+          <w:sz w:val="36"/>
+          <w:szCs w:val="36"/>
+          <w:u w:val="single"/>
+          <w14:ligatures w14:val="none"/>
+        </w:rPr>
         <w:t xml:space="preserve"> (delete me)</w:t>
       </w:r>
       <w:bookmarkEnd w:id="10"/>
@@ -1986,14 +1997,12 @@
       <w:r>
         <w:t xml:space="preserve">into the application. If configured, the user can choose the organisation and language they want to login to (otherwise the default is used as specified in the </w:t>
       </w:r>
-      <w:proofErr w:type="gramStart"/>
       <w:r>
         <w:rPr>
           <w:rFonts w:ascii="Courier New" w:hAnsi="Courier New" w:cs="Courier New"/>
         </w:rPr>
         <w:t>cntrl.loginoption</w:t>
       </w:r>
-      <w:proofErr w:type="gramEnd"/>
       <w:r>
         <w:t xml:space="preserve"> table).</w:t>
       </w:r>
@@ -2075,14 +2084,12 @@
       <w:r>
         <w:t>The Backend API returns a token key for successful logins. The user is then forwarded (</w:t>
       </w:r>
-      <w:proofErr w:type="spellStart"/>
       <w:r>
         <w:rPr>
           <w:rFonts w:ascii="Courier New" w:hAnsi="Courier New" w:cs="Courier New"/>
         </w:rPr>
         <w:t>NavigateTo</w:t>
       </w:r>
-      <w:proofErr w:type="spellEnd"/>
       <w:r>
         <w:t>) to FrontendServer project. This is the actual web client. The forwarding URL is given a fragment that contains the token key.</w:t>
       </w:r>
@@ -2129,16 +2136,15 @@
         </w:numPr>
       </w:pPr>
       <w:r>
+        <w:lastRenderedPageBreak/>
         <w:t xml:space="preserve">If configured (i.e. the </w:t>
       </w:r>
-      <w:proofErr w:type="gramStart"/>
       <w:r>
         <w:rPr>
           <w:rFonts w:ascii="Courier New" w:hAnsi="Courier New" w:cs="Courier New"/>
         </w:rPr>
         <w:t>cntrl.loginoption</w:t>
       </w:r>
-      <w:proofErr w:type="gramEnd"/>
       <w:r>
         <w:t xml:space="preserve"> is flagged as external) then the user is returned the token. They can then use this in their API calls.</w:t>
       </w:r>
@@ -2182,7 +2188,6 @@
     <w:p/>
     <w:p>
       <w:r>
-        <w:lastRenderedPageBreak/>
         <w:br/>
       </w:r>
     </w:p>
@@ -3014,6 +3019,7 @@
   <w:style w:type="paragraph" w:default="1" w:styleId="Normal">
     <w:name w:val="Normal"/>
     <w:qFormat/>
+    <w:rsid w:val="004E3D05"/>
   </w:style>
   <w:style w:type="paragraph" w:styleId="Heading1">
     <w:name w:val="heading 1"/>

</xml_diff>